<commit_message>
diploma: deploy updated public/ frontend (routers, ocr_upload, taskdetails2, templates); ignore loose public debug scripts
</commit_message>
<xml_diff>
--- a/diploma.howplatform.net/public_html/public/templates/evaluation_integration_template.docx
+++ b/diploma.howplatform.net/public_html/public/templates/evaluation_integration_template.docx
@@ -5,21 +5,35 @@
     <w:tbl>
       <w:tblPr>
         <w:tblStyle w:val="TableGrid"/>
+        <w:tblpPr w:leftFromText="180" w:rightFromText="180" w:vertAnchor="text" w:horzAnchor="margin" w:tblpYSpec="inside"/>
         <w:bidiVisual/>
         <w:tblW w:w="0" w:type="auto"/>
+        <w:tblBorders>
+          <w:top w:val="none" w:sz="0" w:space="0" w:color="auto"/>
+          <w:left w:val="none" w:sz="0" w:space="0" w:color="auto"/>
+          <w:bottom w:val="none" w:sz="0" w:space="0" w:color="auto"/>
+          <w:right w:val="none" w:sz="0" w:space="0" w:color="auto"/>
+          <w:insideH w:val="none" w:sz="0" w:space="0" w:color="auto"/>
+          <w:insideV w:val="none" w:sz="0" w:space="0" w:color="auto"/>
+        </w:tblBorders>
         <w:tblLook w:val="04A0" w:firstRow="1" w:lastRow="0" w:firstColumn="1" w:lastColumn="0" w:noHBand="0" w:noVBand="1"/>
       </w:tblPr>
       <w:tblGrid>
-        <w:gridCol w:w="1096"/>
-        <w:gridCol w:w="2136"/>
-        <w:gridCol w:w="1503"/>
-        <w:gridCol w:w="2598"/>
+        <w:gridCol w:w="1528"/>
+        <w:gridCol w:w="3600"/>
+        <w:gridCol w:w="1620"/>
+        <w:gridCol w:w="3150"/>
+        <w:gridCol w:w="1270"/>
+        <w:gridCol w:w="2780"/>
       </w:tblGrid>
       <w:tr>
+        <w:trPr>
+          <w:trHeight w:val="576"/>
+        </w:trPr>
         <w:tc>
           <w:tcPr>
-            <w:tcW w:w="0" w:type="auto"/>
-            <w:hideMark/>
+            <w:tcW w:w="1528" w:type="dxa"/>
+            <w:vAlign w:val="center"/>
           </w:tcPr>
           <w:p>
             <w:pPr>
@@ -36,7 +50,7 @@
             </w:pPr>
             <w:r>
               <w:rPr>
-                <w:rFonts w:ascii="Simplified Arabic" w:eastAsia="Times New Roman" w:hAnsi="Simplified Arabic" w:cs="Simplified Arabic"/>
+                <w:rFonts w:ascii="Simplified Arabic" w:eastAsia="Times New Roman" w:hAnsi="Simplified Arabic" w:cs="Simplified Arabic" w:hint="cs"/>
                 <w:color w:val="000000" w:themeColor="text1"/>
                 <w:sz w:val="28"/>
                 <w:szCs w:val="28"/>
@@ -44,13 +58,64 @@
                 <w:lang w:bidi="ar-JO"/>
               </w:rPr>
               <w:t>اسم المعلم</w:t>
+            </w:r>
+            <w:r>
+              <w:rPr>
+                <w:rFonts w:ascii="Simplified Arabic" w:eastAsia="Times New Roman" w:hAnsi="Simplified Arabic" w:cs="Simplified Arabic" w:hint="cs"/>
+                <w:color w:val="000000" w:themeColor="text1"/>
+                <w:sz w:val="28"/>
+                <w:szCs w:val="28"/>
+                <w:rtl/>
+                <w:lang w:bidi="ar-JO"/>
+              </w:rPr>
+              <w:t>:</w:t>
             </w:r>
           </w:p>
         </w:tc>
         <w:tc>
           <w:tcPr>
-            <w:tcW w:w="0" w:type="auto"/>
-            <w:hideMark/>
+            <w:tcW w:w="3600" w:type="dxa"/>
+            <w:vAlign w:val="center"/>
+          </w:tcPr>
+          <w:p>
+            <w:pPr>
+              <w:bidi/>
+              <w:rPr>
+                <w:rFonts w:ascii="Simplified Arabic" w:eastAsia="Times New Roman" w:hAnsi="Simplified Arabic" w:cs="Simplified Arabic"/>
+                <w:color w:val="000000" w:themeColor="text1"/>
+                <w:rtl/>
+                <w:lang w:bidi="ar-JO"/>
+              </w:rPr>
+            </w:pPr>
+            <w:r>
+              <w:rPr>
+                <w:rFonts w:ascii="Simplified Arabic" w:hAnsi="Simplified Arabic" w:cs="Simplified Arabic"/>
+                <w:color w:val="000000" w:themeColor="text1"/>
+                <w:rtl/>
+              </w:rPr>
+              <w:t>${</w:t>
+            </w:r>
+            <w:r>
+              <w:rPr>
+                <w:rFonts w:ascii="Simplified Arabic" w:hAnsi="Simplified Arabic" w:cs="Simplified Arabic"/>
+                <w:color w:val="000000" w:themeColor="text1"/>
+              </w:rPr>
+              <w:t>teacher_name</w:t>
+            </w:r>
+            <w:r>
+              <w:rPr>
+                <w:rFonts w:ascii="Simplified Arabic" w:hAnsi="Simplified Arabic" w:cs="Simplified Arabic"/>
+                <w:color w:val="000000" w:themeColor="text1"/>
+                <w:rtl/>
+              </w:rPr>
+              <w:t>}</w:t>
+            </w:r>
+          </w:p>
+        </w:tc>
+        <w:tc>
+          <w:tcPr>
+            <w:tcW w:w="1620" w:type="dxa"/>
+            <w:vAlign w:val="center"/>
           </w:tcPr>
           <w:p>
             <w:pPr>
@@ -67,43 +132,60 @@
             </w:pPr>
             <w:r>
               <w:rPr>
-                <w:rFonts w:ascii="Simplified Arabic" w:eastAsia="Times New Roman" w:hAnsi="Simplified Arabic" w:cs="Simplified Arabic"/>
+                <w:rFonts w:ascii="Simplified Arabic" w:eastAsia="Times New Roman" w:hAnsi="Simplified Arabic" w:cs="Simplified Arabic" w:hint="cs"/>
                 <w:color w:val="000000" w:themeColor="text1"/>
                 <w:sz w:val="28"/>
                 <w:szCs w:val="28"/>
                 <w:rtl/>
                 <w:lang w:bidi="ar-JO"/>
               </w:rPr>
-              <w:t>${</w:t>
-            </w:r>
-            <w:proofErr w:type="spellStart"/>
-            <w:r>
-              <w:rPr>
-                <w:rFonts w:ascii="Simplified Arabic" w:eastAsia="Times New Roman" w:hAnsi="Simplified Arabic" w:cs="Simplified Arabic"/>
-                <w:color w:val="000000" w:themeColor="text1"/>
-                <w:sz w:val="28"/>
-                <w:szCs w:val="28"/>
-                <w:lang w:bidi="ar-JO"/>
-              </w:rPr>
-              <w:t>teacher_name</w:t>
-            </w:r>
-            <w:proofErr w:type="spellEnd"/>
-            <w:r>
-              <w:rPr>
-                <w:rFonts w:ascii="Simplified Arabic" w:eastAsia="Times New Roman" w:hAnsi="Simplified Arabic" w:cs="Simplified Arabic"/>
-                <w:color w:val="000000" w:themeColor="text1"/>
-                <w:sz w:val="28"/>
-                <w:szCs w:val="28"/>
-                <w:rtl/>
-                <w:lang w:bidi="ar-JO"/>
-              </w:rPr>
-              <w:t>}</w:t>
+              <w:t>الرقم الأكاديمي:</w:t>
             </w:r>
           </w:p>
         </w:tc>
         <w:tc>
           <w:tcPr>
-            <w:tcW w:w="0" w:type="auto"/>
+            <w:tcW w:w="3150" w:type="dxa"/>
+            <w:vAlign w:val="center"/>
+          </w:tcPr>
+          <w:p>
+            <w:pPr>
+              <w:bidi/>
+              <w:rPr>
+                <w:rFonts w:ascii="Simplified Arabic" w:hAnsi="Simplified Arabic" w:cs="Simplified Arabic"/>
+                <w:color w:val="000000" w:themeColor="text1"/>
+                <w:rtl/>
+              </w:rPr>
+            </w:pPr>
+            <w:r>
+              <w:rPr>
+                <w:rFonts w:ascii="Simplified Arabic" w:hAnsi="Simplified Arabic" w:cs="Simplified Arabic"/>
+                <w:color w:val="000000" w:themeColor="text1"/>
+                <w:rtl/>
+              </w:rPr>
+              <w:t>${</w:t>
+            </w:r>
+            <w:r>
+              <w:rPr>
+                <w:rFonts w:ascii="Simplified Arabic" w:hAnsi="Simplified Arabic" w:cs="Simplified Arabic"/>
+                <w:color w:val="000000" w:themeColor="text1"/>
+              </w:rPr>
+              <w:t>academic_number</w:t>
+            </w:r>
+            <w:r>
+              <w:rPr>
+                <w:rFonts w:ascii="Simplified Arabic" w:hAnsi="Simplified Arabic" w:cs="Simplified Arabic"/>
+                <w:color w:val="000000" w:themeColor="text1"/>
+                <w:rtl/>
+              </w:rPr>
+              <w:t>}</w:t>
+            </w:r>
+          </w:p>
+        </w:tc>
+        <w:tc>
+          <w:tcPr>
+            <w:tcW w:w="1270" w:type="dxa"/>
+            <w:vAlign w:val="center"/>
           </w:tcPr>
           <w:p>
             <w:pPr>
@@ -120,20 +202,80 @@
             </w:pPr>
             <w:r>
               <w:rPr>
-                <w:rFonts w:ascii="Simplified Arabic" w:eastAsia="Times New Roman" w:hAnsi="Simplified Arabic" w:cs="Simplified Arabic"/>
+                <w:rFonts w:ascii="Simplified Arabic" w:eastAsia="Times New Roman" w:hAnsi="Simplified Arabic" w:cs="Simplified Arabic" w:hint="cs"/>
                 <w:color w:val="000000" w:themeColor="text1"/>
                 <w:sz w:val="28"/>
                 <w:szCs w:val="28"/>
                 <w:rtl/>
                 <w:lang w:bidi="ar-JO"/>
               </w:rPr>
-              <w:t>الرقم الأكاديمي</w:t>
+              <w:t>الموضوع</w:t>
+            </w:r>
+            <w:r>
+              <w:rPr>
+                <w:rFonts w:ascii="Simplified Arabic" w:eastAsia="Times New Roman" w:hAnsi="Simplified Arabic" w:cs="Simplified Arabic" w:hint="cs"/>
+                <w:color w:val="000000" w:themeColor="text1"/>
+                <w:sz w:val="28"/>
+                <w:szCs w:val="28"/>
+                <w:rtl/>
+                <w:lang w:bidi="ar-JO"/>
+              </w:rPr>
+              <w:t>:</w:t>
             </w:r>
           </w:p>
         </w:tc>
         <w:tc>
           <w:tcPr>
-            <w:tcW w:w="0" w:type="auto"/>
+            <w:tcW w:w="2780" w:type="dxa"/>
+            <w:vAlign w:val="center"/>
+          </w:tcPr>
+          <w:p>
+            <w:pPr>
+              <w:bidi/>
+              <w:rPr>
+                <w:rFonts w:ascii="Simplified Arabic" w:eastAsia="Times New Roman" w:hAnsi="Simplified Arabic" w:cs="Simplified Arabic"/>
+                <w:color w:val="000000" w:themeColor="text1"/>
+                <w:rtl/>
+                <w:lang w:bidi="ar-JO"/>
+              </w:rPr>
+            </w:pPr>
+            <w:r>
+              <w:rPr>
+                <w:rFonts w:ascii="Simplified Arabic" w:eastAsia="Times New Roman" w:hAnsi="Simplified Arabic" w:cs="Simplified Arabic"/>
+                <w:color w:val="000000" w:themeColor="text1"/>
+                <w:rtl/>
+                <w:lang w:bidi="ar-JO"/>
+              </w:rPr>
+              <w:t>${</w:t>
+            </w:r>
+            <w:r>
+              <w:rPr>
+                <w:rFonts w:ascii="Simplified Arabic" w:eastAsia="Times New Roman" w:hAnsi="Simplified Arabic" w:cs="Simplified Arabic"/>
+                <w:color w:val="000000" w:themeColor="text1"/>
+                <w:lang w:bidi="ar-JO"/>
+              </w:rPr>
+              <w:t>subject_name</w:t>
+            </w:r>
+            <w:r>
+              <w:rPr>
+                <w:rFonts w:ascii="Simplified Arabic" w:eastAsia="Times New Roman" w:hAnsi="Simplified Arabic" w:cs="Simplified Arabic"/>
+                <w:color w:val="000000" w:themeColor="text1"/>
+                <w:rtl/>
+                <w:lang w:bidi="ar-JO"/>
+              </w:rPr>
+              <w:t>}</w:t>
+            </w:r>
+          </w:p>
+        </w:tc>
+      </w:tr>
+      <w:tr>
+        <w:trPr>
+          <w:trHeight w:val="576"/>
+        </w:trPr>
+        <w:tc>
+          <w:tcPr>
+            <w:tcW w:w="1528" w:type="dxa"/>
+            <w:vAlign w:val="center"/>
           </w:tcPr>
           <w:p>
             <w:pPr>
@@ -150,46 +292,60 @@
             </w:pPr>
             <w:r>
               <w:rPr>
-                <w:rFonts w:ascii="Simplified Arabic" w:eastAsia="Times New Roman" w:hAnsi="Simplified Arabic" w:cs="Simplified Arabic"/>
+                <w:rFonts w:ascii="Simplified Arabic" w:eastAsia="Times New Roman" w:hAnsi="Simplified Arabic" w:cs="Simplified Arabic" w:hint="cs"/>
                 <w:color w:val="000000" w:themeColor="text1"/>
                 <w:sz w:val="28"/>
                 <w:szCs w:val="28"/>
                 <w:rtl/>
                 <w:lang w:bidi="ar-JO"/>
               </w:rPr>
-              <w:t>${</w:t>
-            </w:r>
-            <w:proofErr w:type="spellStart"/>
-            <w:r>
-              <w:rPr>
-                <w:rFonts w:ascii="Simplified Arabic" w:eastAsia="Times New Roman" w:hAnsi="Simplified Arabic" w:cs="Simplified Arabic"/>
-                <w:color w:val="000000" w:themeColor="text1"/>
-                <w:sz w:val="28"/>
-                <w:szCs w:val="28"/>
-                <w:lang w:bidi="ar-JO"/>
-              </w:rPr>
-              <w:t>academic_number</w:t>
-            </w:r>
-            <w:proofErr w:type="spellEnd"/>
-            <w:r>
-              <w:rPr>
-                <w:rFonts w:ascii="Simplified Arabic" w:eastAsia="Times New Roman" w:hAnsi="Simplified Arabic" w:cs="Simplified Arabic"/>
-                <w:color w:val="000000" w:themeColor="text1"/>
-                <w:sz w:val="28"/>
-                <w:szCs w:val="28"/>
-                <w:rtl/>
-                <w:lang w:bidi="ar-JO"/>
-              </w:rPr>
-              <w:t>}</w:t>
+              <w:t>الدرس:</w:t>
             </w:r>
           </w:p>
         </w:tc>
-      </w:tr>
-      <w:tr>
         <w:tc>
           <w:tcPr>
-            <w:tcW w:w="0" w:type="auto"/>
-            <w:hideMark/>
+            <w:tcW w:w="3600" w:type="dxa"/>
+            <w:vAlign w:val="center"/>
+          </w:tcPr>
+          <w:p>
+            <w:pPr>
+              <w:bidi/>
+              <w:rPr>
+                <w:rFonts w:ascii="Simplified Arabic" w:hAnsi="Simplified Arabic" w:cs="Simplified Arabic"/>
+                <w:color w:val="000000" w:themeColor="text1"/>
+                <w:rtl/>
+              </w:rPr>
+            </w:pPr>
+            <w:r>
+              <w:rPr>
+                <w:rFonts w:ascii="Simplified Arabic" w:hAnsi="Simplified Arabic" w:cs="Simplified Arabic"/>
+                <w:color w:val="000000" w:themeColor="text1"/>
+                <w:rtl/>
+              </w:rPr>
+              <w:t>${</w:t>
+            </w:r>
+            <w:r>
+              <w:rPr>
+                <w:rFonts w:ascii="Simplified Arabic" w:hAnsi="Simplified Arabic" w:cs="Simplified Arabic"/>
+                <w:color w:val="000000" w:themeColor="text1"/>
+              </w:rPr>
+              <w:t>lesson_title</w:t>
+            </w:r>
+            <w:r>
+              <w:rPr>
+                <w:rFonts w:ascii="Simplified Arabic" w:hAnsi="Simplified Arabic" w:cs="Simplified Arabic"/>
+                <w:color w:val="000000" w:themeColor="text1"/>
+                <w:rtl/>
+              </w:rPr>
+              <w:t>}</w:t>
+            </w:r>
+          </w:p>
+        </w:tc>
+        <w:tc>
+          <w:tcPr>
+            <w:tcW w:w="1620" w:type="dxa"/>
+            <w:vAlign w:val="center"/>
           </w:tcPr>
           <w:p>
             <w:pPr>
@@ -204,23 +360,31 @@
                 <w:lang w:bidi="ar-JO"/>
               </w:rPr>
             </w:pPr>
-            <w:r>
-              <w:rPr>
-                <w:rFonts w:ascii="Simplified Arabic" w:eastAsia="Times New Roman" w:hAnsi="Simplified Arabic" w:cs="Simplified Arabic"/>
-                <w:color w:val="000000" w:themeColor="text1"/>
-                <w:sz w:val="28"/>
-                <w:szCs w:val="28"/>
-                <w:rtl/>
-                <w:lang w:bidi="ar-JO"/>
-              </w:rPr>
-              <w:t>المادة</w:t>
-            </w:r>
           </w:p>
         </w:tc>
         <w:tc>
           <w:tcPr>
-            <w:tcW w:w="0" w:type="auto"/>
-            <w:hideMark/>
+            <w:tcW w:w="3150" w:type="dxa"/>
+            <w:vAlign w:val="center"/>
+          </w:tcPr>
+          <w:p>
+            <w:pPr>
+              <w:bidi/>
+              <w:rPr>
+                <w:rFonts w:ascii="Simplified Arabic" w:eastAsia="Times New Roman" w:hAnsi="Simplified Arabic" w:cs="Simplified Arabic"/>
+                <w:color w:val="000000" w:themeColor="text1"/>
+                <w:sz w:val="28"/>
+                <w:szCs w:val="28"/>
+                <w:rtl/>
+                <w:lang w:bidi="ar-JO"/>
+              </w:rPr>
+            </w:pPr>
+          </w:p>
+        </w:tc>
+        <w:tc>
+          <w:tcPr>
+            <w:tcW w:w="1270" w:type="dxa"/>
+            <w:vAlign w:val="center"/>
           </w:tcPr>
           <w:p>
             <w:pPr>
@@ -235,123 +399,22 @@
                 <w:lang w:bidi="ar-JO"/>
               </w:rPr>
             </w:pPr>
-            <w:r>
-              <w:rPr>
-                <w:rFonts w:ascii="Simplified Arabic" w:eastAsia="Times New Roman" w:hAnsi="Simplified Arabic" w:cs="Simplified Arabic"/>
-                <w:color w:val="000000" w:themeColor="text1"/>
-                <w:sz w:val="28"/>
-                <w:szCs w:val="28"/>
-                <w:rtl/>
-                <w:lang w:bidi="ar-JO"/>
-              </w:rPr>
-              <w:t>${</w:t>
-            </w:r>
-            <w:proofErr w:type="spellStart"/>
-            <w:r>
-              <w:rPr>
-                <w:rFonts w:ascii="Simplified Arabic" w:eastAsia="Times New Roman" w:hAnsi="Simplified Arabic" w:cs="Simplified Arabic"/>
-                <w:color w:val="000000" w:themeColor="text1"/>
-                <w:sz w:val="28"/>
-                <w:szCs w:val="28"/>
-                <w:lang w:bidi="ar-JO"/>
-              </w:rPr>
-              <w:t>subject_name</w:t>
-            </w:r>
-            <w:proofErr w:type="spellEnd"/>
-            <w:r>
-              <w:rPr>
-                <w:rFonts w:ascii="Simplified Arabic" w:eastAsia="Times New Roman" w:hAnsi="Simplified Arabic" w:cs="Simplified Arabic"/>
-                <w:color w:val="000000" w:themeColor="text1"/>
-                <w:sz w:val="28"/>
-                <w:szCs w:val="28"/>
-                <w:rtl/>
-                <w:lang w:bidi="ar-JO"/>
-              </w:rPr>
-              <w:t>}</w:t>
-            </w:r>
           </w:p>
         </w:tc>
         <w:tc>
           <w:tcPr>
-            <w:tcW w:w="0" w:type="auto"/>
+            <w:tcW w:w="2780" w:type="dxa"/>
+            <w:vAlign w:val="center"/>
           </w:tcPr>
           <w:p>
             <w:pPr>
               <w:bidi/>
-              <w:jc w:val="center"/>
-              <w:rPr>
-                <w:rFonts w:ascii="Simplified Arabic" w:eastAsia="Times New Roman" w:hAnsi="Simplified Arabic" w:cs="Simplified Arabic"/>
-                <w:color w:val="000000" w:themeColor="text1"/>
-                <w:sz w:val="28"/>
-                <w:szCs w:val="28"/>
-                <w:rtl/>
-                <w:lang w:bidi="ar-JO"/>
+              <w:rPr>
+                <w:rFonts w:ascii="Simplified Arabic" w:hAnsi="Simplified Arabic" w:cs="Simplified Arabic"/>
+                <w:color w:val="000000" w:themeColor="text1"/>
+                <w:rtl/>
               </w:rPr>
             </w:pPr>
-            <w:r>
-              <w:rPr>
-                <w:rFonts w:ascii="Simplified Arabic" w:eastAsia="Times New Roman" w:hAnsi="Simplified Arabic" w:cs="Simplified Arabic"/>
-                <w:color w:val="000000" w:themeColor="text1"/>
-                <w:sz w:val="28"/>
-                <w:szCs w:val="28"/>
-                <w:rtl/>
-                <w:lang w:bidi="ar-JO"/>
-              </w:rPr>
-              <w:t>عنوان الدرس</w:t>
-            </w:r>
-          </w:p>
-        </w:tc>
-        <w:tc>
-          <w:tcPr>
-            <w:tcW w:w="0" w:type="auto"/>
-          </w:tcPr>
-          <w:p>
-            <w:pPr>
-              <w:bidi/>
-              <w:jc w:val="center"/>
-              <w:rPr>
-                <w:rFonts w:ascii="Simplified Arabic" w:eastAsia="Times New Roman" w:hAnsi="Simplified Arabic" w:cs="Simplified Arabic"/>
-                <w:color w:val="000000" w:themeColor="text1"/>
-                <w:sz w:val="28"/>
-                <w:szCs w:val="28"/>
-                <w:rtl/>
-                <w:lang w:bidi="ar-JO"/>
-              </w:rPr>
-            </w:pPr>
-            <w:r>
-              <w:rPr>
-                <w:rFonts w:ascii="Simplified Arabic" w:eastAsia="Times New Roman" w:hAnsi="Simplified Arabic" w:cs="Simplified Arabic"/>
-                <w:color w:val="000000" w:themeColor="text1"/>
-                <w:sz w:val="28"/>
-                <w:szCs w:val="28"/>
-                <w:rtl/>
-                <w:lang w:bidi="ar-JO"/>
-              </w:rPr>
-              <w:t>${</w:t>
-            </w:r>
-            <w:proofErr w:type="spellStart"/>
-            <w:r>
-              <w:rPr>
-                <w:rFonts w:ascii="Simplified Arabic" w:eastAsia="Times New Roman" w:hAnsi="Simplified Arabic" w:cs="Simplified Arabic"/>
-                <w:color w:val="000000" w:themeColor="text1"/>
-                <w:sz w:val="28"/>
-                <w:szCs w:val="28"/>
-                <w:lang w:bidi="ar-JO"/>
-              </w:rPr>
-              <w:t>lesson_title</w:t>
-            </w:r>
-            <w:proofErr w:type="spellEnd"/>
-            <w:r>
-              <w:rPr>
-                <w:rFonts w:ascii="Simplified Arabic" w:eastAsia="Times New Roman" w:hAnsi="Simplified Arabic" w:cs="Simplified Arabic"/>
-                <w:color w:val="000000" w:themeColor="text1"/>
-                <w:sz w:val="28"/>
-                <w:szCs w:val="28"/>
-                <w:rtl/>
-                <w:lang w:bidi="ar-JO"/>
-              </w:rPr>
-              <w:t>}</w:t>
-            </w:r>
           </w:p>
         </w:tc>
       </w:tr>
@@ -359,15 +422,6 @@
     <w:p>
       <w:pPr>
         <w:bidi/>
-        <w:rPr>
-          <w:rFonts w:ascii="Sakkal Majalla" w:eastAsia="Sakkal Majalla" w:hAnsi="Sakkal Majalla" w:cs="Sakkal Majalla"/>
-          <w:b/>
-          <w:bCs/>
-          <w:color w:val="000000" w:themeColor="text1"/>
-          <w:rtl/>
-        </w:rPr>
-      </w:pPr>
-      <w:r>
         <w:rPr>
           <w:rFonts w:ascii="Sakkal Majalla" w:eastAsia="Sakkal Majalla" w:hAnsi="Sakkal Majalla" w:cs="Sakkal Majalla"/>
           <w:b/>
@@ -375,32 +429,7 @@
           <w:color w:val="000000" w:themeColor="text1"/>
           <w:lang w:bidi="ar-JO"/>
         </w:rPr>
-        <w:pict w14:anchorId="4CB6455A">
-          <v:rect id="_x0000_i1045" style="width:0;height:1.5pt" o:hralign="center" o:hrstd="t" o:hrnoshade="t" o:hr="t" fillcolor="gray" stroked="f"/>
-        </w:pict>
-      </w:r>
-    </w:p>
-    <w:p>
-      <w:pPr>
-        <w:bidi/>
-        <w:rPr>
-          <w:rFonts w:ascii="Sakkal Majalla" w:eastAsia="Sakkal Majalla" w:hAnsi="Sakkal Majalla" w:cs="Sakkal Majalla"/>
-          <w:b/>
-          <w:bCs/>
-          <w:color w:val="000000" w:themeColor="text1"/>
-          <w:rtl/>
-        </w:rPr>
-      </w:pPr>
-      <w:r>
-        <w:rPr>
-          <w:rFonts w:ascii="Sakkal Majalla" w:eastAsia="Sakkal Majalla" w:hAnsi="Sakkal Majalla" w:cs="Sakkal Majalla"/>
-          <w:b/>
-          <w:bCs/>
-          <w:color w:val="000000" w:themeColor="text1"/>
-          <w:rtl/>
-        </w:rPr>
-        <w:t>ثانياً: التصميم التعليمي (المعرفي والمهاري)</w:t>
-      </w:r>
+      </w:pPr>
     </w:p>
     <w:tbl>
       <w:tblPr>
@@ -410,28 +439,27 @@
         <w:tblLook w:val="04A0" w:firstRow="1" w:lastRow="0" w:firstColumn="1" w:lastColumn="0" w:noHBand="0" w:noVBand="1"/>
       </w:tblPr>
       <w:tblGrid>
-        <w:gridCol w:w="682"/>
-        <w:gridCol w:w="1264"/>
-        <w:gridCol w:w="1220"/>
-        <w:gridCol w:w="1656"/>
-        <w:gridCol w:w="1048"/>
+        <w:gridCol w:w="4392"/>
+        <w:gridCol w:w="4392"/>
+        <w:gridCol w:w="4392"/>
       </w:tblGrid>
       <w:tr>
         <w:tc>
           <w:tcPr>
-            <w:tcW w:w="0" w:type="auto"/>
-            <w:hideMark/>
+            <w:tcW w:w="4392" w:type="dxa"/>
+            <w:shd w:val="clear" w:color="auto" w:fill="D9D9D9" w:themeFill="background1" w:themeFillShade="D9"/>
           </w:tcPr>
           <w:p>
             <w:pPr>
               <w:bidi/>
-              <w:spacing w:after="160" w:line="278" w:lineRule="auto"/>
+              <w:jc w:val="center"/>
               <w:rPr>
                 <w:rFonts w:ascii="Sakkal Majalla" w:eastAsia="Sakkal Majalla" w:hAnsi="Sakkal Majalla" w:cs="Sakkal Majalla"/>
                 <w:b/>
                 <w:bCs/>
                 <w:color w:val="000000" w:themeColor="text1"/>
                 <w:rtl/>
+                <w:lang w:bidi="ar-JO"/>
               </w:rPr>
             </w:pPr>
             <w:r>
@@ -441,26 +469,28 @@
                 <w:bCs/>
                 <w:color w:val="000000" w:themeColor="text1"/>
                 <w:rtl/>
-              </w:rPr>
-              <w:t>المجال</w:t>
+                <w:lang w:bidi="ar-JO"/>
+              </w:rPr>
+              <w:t>الكفاية المعرفية من كفايات المنهاج</w:t>
             </w:r>
           </w:p>
         </w:tc>
         <w:tc>
           <w:tcPr>
-            <w:tcW w:w="0" w:type="auto"/>
-            <w:hideMark/>
+            <w:tcW w:w="4392" w:type="dxa"/>
+            <w:shd w:val="clear" w:color="auto" w:fill="D9D9D9" w:themeFill="background1" w:themeFillShade="D9"/>
           </w:tcPr>
           <w:p>
             <w:pPr>
               <w:bidi/>
-              <w:spacing w:after="160" w:line="278" w:lineRule="auto"/>
+              <w:jc w:val="center"/>
               <w:rPr>
                 <w:rFonts w:ascii="Sakkal Majalla" w:eastAsia="Sakkal Majalla" w:hAnsi="Sakkal Majalla" w:cs="Sakkal Majalla"/>
                 <w:b/>
                 <w:bCs/>
                 <w:color w:val="000000" w:themeColor="text1"/>
                 <w:rtl/>
+                <w:lang w:bidi="ar-JO"/>
               </w:rPr>
             </w:pPr>
             <w:r>
@@ -470,26 +500,28 @@
                 <w:bCs/>
                 <w:color w:val="000000" w:themeColor="text1"/>
                 <w:rtl/>
-              </w:rPr>
-              <w:t>النتاج التعليمي</w:t>
+                <w:lang w:bidi="ar-JO"/>
+              </w:rPr>
+              <w:t>نتاج تعلم معرفي</w:t>
             </w:r>
           </w:p>
         </w:tc>
         <w:tc>
           <w:tcPr>
-            <w:tcW w:w="0" w:type="auto"/>
-            <w:hideMark/>
+            <w:tcW w:w="4392" w:type="dxa"/>
+            <w:shd w:val="clear" w:color="auto" w:fill="D9D9D9" w:themeFill="background1" w:themeFillShade="D9"/>
           </w:tcPr>
           <w:p>
             <w:pPr>
               <w:bidi/>
-              <w:spacing w:after="160" w:line="278" w:lineRule="auto"/>
+              <w:jc w:val="center"/>
               <w:rPr>
                 <w:rFonts w:ascii="Sakkal Majalla" w:eastAsia="Sakkal Majalla" w:hAnsi="Sakkal Majalla" w:cs="Sakkal Majalla"/>
                 <w:b/>
                 <w:bCs/>
                 <w:color w:val="000000" w:themeColor="text1"/>
                 <w:rtl/>
+                <w:lang w:bidi="ar-JO"/>
               </w:rPr>
             </w:pPr>
             <w:r>
@@ -499,66 +531,9 @@
                 <w:bCs/>
                 <w:color w:val="000000" w:themeColor="text1"/>
                 <w:rtl/>
-              </w:rPr>
-              <w:t>مؤشرات الأداء</w:t>
-            </w:r>
-          </w:p>
-        </w:tc>
-        <w:tc>
-          <w:tcPr>
-            <w:tcW w:w="0" w:type="auto"/>
-            <w:hideMark/>
-          </w:tcPr>
-          <w:p>
-            <w:pPr>
-              <w:bidi/>
-              <w:spacing w:after="160" w:line="278" w:lineRule="auto"/>
-              <w:rPr>
-                <w:rFonts w:ascii="Sakkal Majalla" w:eastAsia="Sakkal Majalla" w:hAnsi="Sakkal Majalla" w:cs="Sakkal Majalla"/>
-                <w:b/>
-                <w:bCs/>
-                <w:color w:val="000000" w:themeColor="text1"/>
-                <w:rtl/>
-              </w:rPr>
-            </w:pPr>
-            <w:r>
-              <w:rPr>
-                <w:rFonts w:ascii="Sakkal Majalla" w:eastAsia="Sakkal Majalla" w:hAnsi="Sakkal Majalla" w:cs="Sakkal Majalla"/>
-                <w:b/>
-                <w:bCs/>
-                <w:color w:val="000000" w:themeColor="text1"/>
-                <w:rtl/>
-              </w:rPr>
-              <w:t>استراتيجية التدريس</w:t>
-            </w:r>
-          </w:p>
-        </w:tc>
-        <w:tc>
-          <w:tcPr>
-            <w:tcW w:w="0" w:type="auto"/>
-            <w:hideMark/>
-          </w:tcPr>
-          <w:p>
-            <w:pPr>
-              <w:bidi/>
-              <w:spacing w:after="160" w:line="278" w:lineRule="auto"/>
-              <w:rPr>
-                <w:rFonts w:ascii="Sakkal Majalla" w:eastAsia="Sakkal Majalla" w:hAnsi="Sakkal Majalla" w:cs="Sakkal Majalla"/>
-                <w:b/>
-                <w:bCs/>
-                <w:color w:val="000000" w:themeColor="text1"/>
-                <w:rtl/>
-              </w:rPr>
-            </w:pPr>
-            <w:r>
-              <w:rPr>
-                <w:rFonts w:ascii="Sakkal Majalla" w:eastAsia="Sakkal Majalla" w:hAnsi="Sakkal Majalla" w:cs="Sakkal Majalla"/>
-                <w:b/>
-                <w:bCs/>
-                <w:color w:val="000000" w:themeColor="text1"/>
-                <w:rtl/>
-              </w:rPr>
-              <w:t>أداة التقويم</w:t>
+                <w:lang w:bidi="ar-JO"/>
+              </w:rPr>
+              <w:t>نتاج تعلم مهاري</w:t>
             </w:r>
           </w:p>
         </w:tc>
@@ -566,63 +541,137 @@
       <w:tr>
         <w:tc>
           <w:tcPr>
-            <w:tcW w:w="0" w:type="auto"/>
-            <w:hideMark/>
+            <w:tcW w:w="4392" w:type="dxa"/>
+            <w:vMerge w:val="restart"/>
           </w:tcPr>
           <w:p>
             <w:pPr>
               <w:bidi/>
-              <w:spacing w:after="160" w:line="278" w:lineRule="auto"/>
               <w:rPr>
                 <w:rFonts w:ascii="Sakkal Majalla" w:eastAsia="Sakkal Majalla" w:hAnsi="Sakkal Majalla" w:cs="Sakkal Majalla"/>
-                <w:b/>
-                <w:bCs/>
-                <w:color w:val="000000" w:themeColor="text1"/>
-                <w:rtl/>
+                <w:color w:val="000000" w:themeColor="text1"/>
+                <w:rtl/>
+                <w:lang w:bidi="ar-JO"/>
               </w:rPr>
             </w:pPr>
             <w:r>
               <w:rPr>
                 <w:rFonts w:ascii="Sakkal Majalla" w:eastAsia="Sakkal Majalla" w:hAnsi="Sakkal Majalla" w:cs="Sakkal Majalla"/>
-                <w:b/>
-                <w:bCs/>
-                <w:color w:val="000000" w:themeColor="text1"/>
-                <w:rtl/>
-              </w:rPr>
-              <w:t>المعرفي</w:t>
+                <w:color w:val="000000" w:themeColor="text1"/>
+                <w:rtl/>
+                <w:lang w:bidi="ar-JO"/>
+              </w:rPr>
+              <w:t>نتاجات التعلم</w:t>
             </w:r>
           </w:p>
         </w:tc>
         <w:tc>
           <w:tcPr>
-            <w:tcW w:w="0" w:type="auto"/>
+            <w:tcW w:w="4392" w:type="dxa"/>
           </w:tcPr>
           <w:p>
             <w:pPr>
               <w:bidi/>
-              <w:spacing w:after="160" w:line="278" w:lineRule="auto"/>
+              <w:rPr>
+                <w:rFonts w:ascii="Simplified Arabic" w:hAnsi="Simplified Arabic" w:cs="Simplified Arabic"/>
+                <w:color w:val="000000" w:themeColor="text1"/>
+                <w:rtl/>
+              </w:rPr>
+            </w:pPr>
+            <w:r>
+              <w:rPr>
+                <w:rFonts w:ascii="Simplified Arabic" w:hAnsi="Simplified Arabic" w:cs="Simplified Arabic"/>
+                <w:color w:val="000000" w:themeColor="text1"/>
+                <w:rtl/>
+              </w:rPr>
+              <w:t>${</w:t>
+            </w:r>
+            <w:r>
+              <w:rPr>
+                <w:rFonts w:ascii="Simplified Arabic" w:hAnsi="Simplified Arabic" w:cs="Simplified Arabic"/>
+                <w:color w:val="000000" w:themeColor="text1"/>
+              </w:rPr>
+              <w:t>cognitive_outcome</w:t>
+            </w:r>
+            <w:r>
+              <w:rPr>
+                <w:rFonts w:ascii="Simplified Arabic" w:hAnsi="Simplified Arabic" w:cs="Simplified Arabic"/>
+                <w:color w:val="000000" w:themeColor="text1"/>
+                <w:rtl/>
+              </w:rPr>
+              <w:t>}</w:t>
+            </w:r>
+          </w:p>
+        </w:tc>
+        <w:tc>
+          <w:tcPr>
+            <w:tcW w:w="4392" w:type="dxa"/>
+          </w:tcPr>
+          <w:p>
+            <w:pPr>
+              <w:tabs>
+                <w:tab w:val="left" w:pos="720"/>
+              </w:tabs>
+              <w:bidi/>
+              <w:rPr>
+                <w:rFonts w:ascii="Simplified Arabic" w:hAnsi="Simplified Arabic" w:cs="Simplified Arabic"/>
+                <w:color w:val="000000" w:themeColor="text1"/>
+                <w:rtl/>
+              </w:rPr>
+            </w:pPr>
+            <w:r>
+              <w:rPr>
+                <w:rFonts w:ascii="Simplified Arabic" w:hAnsi="Simplified Arabic" w:cs="Simplified Arabic"/>
+                <w:color w:val="000000" w:themeColor="text1"/>
+                <w:rtl/>
+              </w:rPr>
+              <w:t>${</w:t>
+            </w:r>
+            <w:r>
+              <w:rPr>
+                <w:rFonts w:ascii="Simplified Arabic" w:hAnsi="Simplified Arabic" w:cs="Simplified Arabic"/>
+                <w:color w:val="000000" w:themeColor="text1"/>
+              </w:rPr>
+              <w:t>skill_outcome</w:t>
+            </w:r>
+            <w:r>
+              <w:rPr>
+                <w:rFonts w:ascii="Simplified Arabic" w:hAnsi="Simplified Arabic" w:cs="Simplified Arabic"/>
+                <w:color w:val="000000" w:themeColor="text1"/>
+                <w:rtl/>
+              </w:rPr>
+              <w:t>}</w:t>
+            </w:r>
+          </w:p>
+        </w:tc>
+      </w:tr>
+      <w:tr>
+        <w:tc>
+          <w:tcPr>
+            <w:tcW w:w="4392" w:type="dxa"/>
+            <w:vMerge/>
+          </w:tcPr>
+          <w:p>
+            <w:pPr>
+              <w:bidi/>
               <w:rPr>
                 <w:rFonts w:ascii="Sakkal Majalla" w:eastAsia="Sakkal Majalla" w:hAnsi="Sakkal Majalla" w:cs="Sakkal Majalla"/>
-                <w:b/>
-                <w:bCs/>
-                <w:color w:val="000000" w:themeColor="text1"/>
-                <w:rtl/>
+                <w:color w:val="000000" w:themeColor="text1"/>
+                <w:rtl/>
+                <w:lang w:bidi="ar-JO"/>
               </w:rPr>
             </w:pPr>
           </w:p>
         </w:tc>
         <w:tc>
           <w:tcPr>
-            <w:tcW w:w="0" w:type="auto"/>
+            <w:tcW w:w="4392" w:type="dxa"/>
           </w:tcPr>
           <w:p>
             <w:pPr>
               <w:bidi/>
-              <w:spacing w:after="160" w:line="278" w:lineRule="auto"/>
-              <w:rPr>
-                <w:rFonts w:ascii="Sakkal Majalla" w:eastAsia="Sakkal Majalla" w:hAnsi="Sakkal Majalla" w:cs="Sakkal Majalla"/>
-                <w:b/>
-                <w:bCs/>
+              <w:rPr>
+                <w:rFonts w:ascii="Simplified Arabic" w:hAnsi="Simplified Arabic" w:cs="Simplified Arabic"/>
                 <w:color w:val="000000" w:themeColor="text1"/>
                 <w:rtl/>
               </w:rPr>
@@ -631,34 +680,13 @@
         </w:tc>
         <w:tc>
           <w:tcPr>
-            <w:tcW w:w="0" w:type="auto"/>
+            <w:tcW w:w="4392" w:type="dxa"/>
           </w:tcPr>
           <w:p>
             <w:pPr>
               <w:bidi/>
-              <w:spacing w:after="160" w:line="278" w:lineRule="auto"/>
-              <w:rPr>
-                <w:rFonts w:ascii="Sakkal Majalla" w:eastAsia="Sakkal Majalla" w:hAnsi="Sakkal Majalla" w:cs="Sakkal Majalla"/>
-                <w:b/>
-                <w:bCs/>
-                <w:color w:val="000000" w:themeColor="text1"/>
-                <w:rtl/>
-              </w:rPr>
-            </w:pPr>
-          </w:p>
-        </w:tc>
-        <w:tc>
-          <w:tcPr>
-            <w:tcW w:w="0" w:type="auto"/>
-          </w:tcPr>
-          <w:p>
-            <w:pPr>
-              <w:bidi/>
-              <w:spacing w:after="160" w:line="278" w:lineRule="auto"/>
-              <w:rPr>
-                <w:rFonts w:ascii="Sakkal Majalla" w:eastAsia="Sakkal Majalla" w:hAnsi="Sakkal Majalla" w:cs="Sakkal Majalla"/>
-                <w:b/>
-                <w:bCs/>
+              <w:rPr>
+                <w:rFonts w:ascii="Simplified Arabic" w:hAnsi="Simplified Arabic" w:cs="Simplified Arabic"/>
                 <w:color w:val="000000" w:themeColor="text1"/>
                 <w:rtl/>
               </w:rPr>
@@ -669,280 +697,103 @@
       <w:tr>
         <w:tc>
           <w:tcPr>
-            <w:tcW w:w="0" w:type="auto"/>
-            <w:hideMark/>
+            <w:tcW w:w="4392" w:type="dxa"/>
+            <w:vMerge w:val="restart"/>
           </w:tcPr>
           <w:p>
             <w:pPr>
               <w:bidi/>
-              <w:spacing w:after="160" w:line="278" w:lineRule="auto"/>
               <w:rPr>
                 <w:rFonts w:ascii="Sakkal Majalla" w:eastAsia="Sakkal Majalla" w:hAnsi="Sakkal Majalla" w:cs="Sakkal Majalla"/>
-                <w:b/>
-                <w:bCs/>
-                <w:color w:val="000000" w:themeColor="text1"/>
-                <w:rtl/>
+                <w:color w:val="000000" w:themeColor="text1"/>
+                <w:rtl/>
+                <w:lang w:bidi="ar-JO"/>
               </w:rPr>
             </w:pPr>
             <w:r>
               <w:rPr>
                 <w:rFonts w:ascii="Sakkal Majalla" w:eastAsia="Sakkal Majalla" w:hAnsi="Sakkal Majalla" w:cs="Sakkal Majalla"/>
-                <w:b/>
-                <w:bCs/>
-                <w:color w:val="000000" w:themeColor="text1"/>
-                <w:rtl/>
-              </w:rPr>
-              <w:t>المهاري</w:t>
+                <w:color w:val="000000" w:themeColor="text1"/>
+                <w:rtl/>
+                <w:lang w:bidi="ar-JO"/>
+              </w:rPr>
+              <w:t xml:space="preserve">مؤشرات التعلم لكل نتاج </w:t>
             </w:r>
           </w:p>
         </w:tc>
         <w:tc>
           <w:tcPr>
-            <w:tcW w:w="0" w:type="auto"/>
+            <w:tcW w:w="4392" w:type="dxa"/>
           </w:tcPr>
           <w:p>
             <w:pPr>
               <w:bidi/>
-              <w:spacing w:after="160" w:line="278" w:lineRule="auto"/>
-              <w:rPr>
-                <w:rFonts w:ascii="Sakkal Majalla" w:eastAsia="Sakkal Majalla" w:hAnsi="Sakkal Majalla" w:cs="Sakkal Majalla"/>
-                <w:b/>
-                <w:bCs/>
+              <w:rPr>
+                <w:rFonts w:ascii="Simplified Arabic" w:hAnsi="Simplified Arabic" w:cs="Simplified Arabic"/>
                 <w:color w:val="000000" w:themeColor="text1"/>
                 <w:rtl/>
               </w:rPr>
             </w:pPr>
+            <w:r>
+              <w:rPr>
+                <w:rFonts w:ascii="Simplified Arabic" w:hAnsi="Simplified Arabic" w:cs="Simplified Arabic"/>
+                <w:color w:val="000000" w:themeColor="text1"/>
+                <w:rtl/>
+              </w:rPr>
+              <w:t>${</w:t>
+            </w:r>
+            <w:r>
+              <w:rPr>
+                <w:rFonts w:ascii="Simplified Arabic" w:hAnsi="Simplified Arabic" w:cs="Simplified Arabic"/>
+                <w:color w:val="000000" w:themeColor="text1"/>
+              </w:rPr>
+              <w:t>cognitive_indicators</w:t>
+            </w:r>
+            <w:r>
+              <w:rPr>
+                <w:rFonts w:ascii="Simplified Arabic" w:hAnsi="Simplified Arabic" w:cs="Simplified Arabic"/>
+                <w:color w:val="000000" w:themeColor="text1"/>
+                <w:rtl/>
+              </w:rPr>
+              <w:t>}</w:t>
+            </w:r>
           </w:p>
         </w:tc>
         <w:tc>
           <w:tcPr>
-            <w:tcW w:w="0" w:type="auto"/>
+            <w:tcW w:w="4392" w:type="dxa"/>
           </w:tcPr>
           <w:p>
             <w:pPr>
               <w:bidi/>
-              <w:spacing w:after="160" w:line="278" w:lineRule="auto"/>
-              <w:rPr>
-                <w:rFonts w:ascii="Sakkal Majalla" w:eastAsia="Sakkal Majalla" w:hAnsi="Sakkal Majalla" w:cs="Sakkal Majalla"/>
-                <w:b/>
-                <w:bCs/>
+              <w:rPr>
+                <w:rFonts w:ascii="Simplified Arabic" w:hAnsi="Simplified Arabic" w:cs="Simplified Arabic"/>
                 <w:color w:val="000000" w:themeColor="text1"/>
                 <w:rtl/>
               </w:rPr>
             </w:pPr>
-          </w:p>
-        </w:tc>
-        <w:tc>
-          <w:tcPr>
-            <w:tcW w:w="0" w:type="auto"/>
-          </w:tcPr>
-          <w:p>
-            <w:pPr>
-              <w:bidi/>
-              <w:spacing w:after="160" w:line="278" w:lineRule="auto"/>
-              <w:rPr>
-                <w:rFonts w:ascii="Sakkal Majalla" w:eastAsia="Sakkal Majalla" w:hAnsi="Sakkal Majalla" w:cs="Sakkal Majalla"/>
-                <w:b/>
-                <w:bCs/>
-                <w:color w:val="000000" w:themeColor="text1"/>
-                <w:rtl/>
-              </w:rPr>
-            </w:pPr>
-          </w:p>
-        </w:tc>
-        <w:tc>
-          <w:tcPr>
-            <w:tcW w:w="0" w:type="auto"/>
-          </w:tcPr>
-          <w:p>
-            <w:pPr>
-              <w:bidi/>
-              <w:spacing w:after="160" w:line="278" w:lineRule="auto"/>
-              <w:rPr>
-                <w:rFonts w:ascii="Sakkal Majalla" w:eastAsia="Sakkal Majalla" w:hAnsi="Sakkal Majalla" w:cs="Sakkal Majalla"/>
-                <w:b/>
-                <w:bCs/>
-                <w:color w:val="000000" w:themeColor="text1"/>
-                <w:rtl/>
-              </w:rPr>
-            </w:pPr>
-          </w:p>
-        </w:tc>
-      </w:tr>
-    </w:tbl>
-    <w:p>
-      <w:pPr>
-        <w:bidi/>
-        <w:rPr>
-          <w:rFonts w:ascii="Sakkal Majalla" w:eastAsia="Sakkal Majalla" w:hAnsi="Sakkal Majalla" w:cs="Sakkal Majalla"/>
-          <w:b/>
-          <w:bCs/>
-          <w:color w:val="000000" w:themeColor="text1"/>
-          <w:rtl/>
-        </w:rPr>
-      </w:pPr>
-      <w:r>
-        <w:rPr>
-          <w:rFonts w:ascii="Sakkal Majalla" w:eastAsia="Sakkal Majalla" w:hAnsi="Sakkal Majalla" w:cs="Sakkal Majalla"/>
-          <w:b/>
-          <w:bCs/>
-          <w:color w:val="000000" w:themeColor="text1"/>
-          <w:lang w:bidi="ar-JO"/>
-        </w:rPr>
-        <w:pict w14:anchorId="078F606B">
-          <v:rect id="_x0000_i1046" style="width:0;height:1.5pt" o:hralign="center" o:hrstd="t" o:hrnoshade="t" o:hr="t" fillcolor="gray" stroked="f"/>
-        </w:pict>
-      </w:r>
-    </w:p>
-    <w:p>
-      <w:pPr>
-        <w:bidi/>
-        <w:rPr>
-          <w:rFonts w:ascii="Sakkal Majalla" w:eastAsia="Sakkal Majalla" w:hAnsi="Sakkal Majalla" w:cs="Sakkal Majalla"/>
-          <w:b/>
-          <w:bCs/>
-          <w:color w:val="000000" w:themeColor="text1"/>
-          <w:rtl/>
-        </w:rPr>
-      </w:pPr>
-      <w:r>
-        <w:rPr>
-          <w:rFonts w:ascii="Sakkal Majalla" w:eastAsia="Sakkal Majalla" w:hAnsi="Sakkal Majalla" w:cs="Sakkal Majalla"/>
-          <w:b/>
-          <w:bCs/>
-          <w:color w:val="000000" w:themeColor="text1"/>
-          <w:rtl/>
-        </w:rPr>
-        <w:t>ثالثاً: التأمل الذاتي والقرارات (بناءً على نتائج التقويم)</w:t>
-      </w:r>
-    </w:p>
-    <w:tbl>
-      <w:tblPr>
-        <w:tblStyle w:val="TableGrid"/>
-        <w:bidiVisual/>
-        <w:tblW w:w="0" w:type="auto"/>
-        <w:tblLook w:val="04A0" w:firstRow="1" w:lastRow="0" w:firstColumn="1" w:lastColumn="0" w:noHBand="0" w:noVBand="1"/>
-      </w:tblPr>
-      <w:tblGrid>
-        <w:gridCol w:w="2295"/>
-        <w:gridCol w:w="1583"/>
-        <w:gridCol w:w="1075"/>
-        <w:gridCol w:w="1572"/>
-      </w:tblGrid>
-      <w:tr>
-        <w:tc>
-          <w:tcPr>
-            <w:tcW w:w="0" w:type="auto"/>
-            <w:hideMark/>
-          </w:tcPr>
-          <w:p>
-            <w:pPr>
-              <w:bidi/>
-              <w:spacing w:after="160" w:line="278" w:lineRule="auto"/>
-              <w:rPr>
-                <w:rFonts w:ascii="Sakkal Majalla" w:eastAsia="Sakkal Majalla" w:hAnsi="Sakkal Majalla" w:cs="Sakkal Majalla"/>
-                <w:b/>
-                <w:bCs/>
-                <w:color w:val="000000" w:themeColor="text1"/>
-                <w:rtl/>
-              </w:rPr>
-            </w:pPr>
-            <w:r>
-              <w:rPr>
-                <w:rFonts w:ascii="Sakkal Majalla" w:eastAsia="Sakkal Majalla" w:hAnsi="Sakkal Majalla" w:cs="Sakkal Majalla"/>
-                <w:b/>
-                <w:bCs/>
-                <w:color w:val="000000" w:themeColor="text1"/>
-                <w:rtl/>
-              </w:rPr>
-              <w:t>مستوى النتائج</w:t>
-            </w:r>
-          </w:p>
-        </w:tc>
-        <w:tc>
-          <w:tcPr>
-            <w:tcW w:w="0" w:type="auto"/>
-            <w:hideMark/>
-          </w:tcPr>
-          <w:p>
-            <w:pPr>
-              <w:bidi/>
-              <w:spacing w:after="160" w:line="278" w:lineRule="auto"/>
-              <w:rPr>
-                <w:rFonts w:ascii="Sakkal Majalla" w:eastAsia="Sakkal Majalla" w:hAnsi="Sakkal Majalla" w:cs="Sakkal Majalla"/>
-                <w:b/>
-                <w:bCs/>
-                <w:color w:val="000000" w:themeColor="text1"/>
-                <w:rtl/>
-              </w:rPr>
-            </w:pPr>
-            <w:r>
-              <w:rPr>
-                <w:rFonts w:ascii="Sakkal Majalla" w:eastAsia="Sakkal Majalla" w:hAnsi="Sakkal Majalla" w:cs="Sakkal Majalla"/>
-                <w:b/>
-                <w:bCs/>
-                <w:color w:val="000000" w:themeColor="text1"/>
-                <w:rtl/>
-              </w:rPr>
-              <w:t>التعامل مع البيانات</w:t>
-            </w:r>
-          </w:p>
-        </w:tc>
-        <w:tc>
-          <w:tcPr>
-            <w:tcW w:w="0" w:type="auto"/>
-            <w:hideMark/>
-          </w:tcPr>
-          <w:p>
-            <w:pPr>
-              <w:bidi/>
-              <w:spacing w:after="160" w:line="278" w:lineRule="auto"/>
-              <w:rPr>
-                <w:rFonts w:ascii="Sakkal Majalla" w:eastAsia="Sakkal Majalla" w:hAnsi="Sakkal Majalla" w:cs="Sakkal Majalla"/>
-                <w:b/>
-                <w:bCs/>
-                <w:color w:val="000000" w:themeColor="text1"/>
-                <w:rtl/>
-              </w:rPr>
-            </w:pPr>
-            <w:r>
-              <w:rPr>
-                <w:rFonts w:ascii="Sakkal Majalla" w:eastAsia="Sakkal Majalla" w:hAnsi="Sakkal Majalla" w:cs="Sakkal Majalla"/>
-                <w:b/>
-                <w:bCs/>
-                <w:color w:val="000000" w:themeColor="text1"/>
-                <w:rtl/>
-              </w:rPr>
-              <w:t>القرار المتخذ</w:t>
-            </w:r>
-          </w:p>
-        </w:tc>
-        <w:tc>
-          <w:tcPr>
-            <w:tcW w:w="0" w:type="auto"/>
-            <w:hideMark/>
-          </w:tcPr>
-          <w:p>
-            <w:pPr>
-              <w:bidi/>
-              <w:spacing w:after="160" w:line="278" w:lineRule="auto"/>
-              <w:rPr>
-                <w:rFonts w:ascii="Sakkal Majalla" w:eastAsia="Sakkal Majalla" w:hAnsi="Sakkal Majalla" w:cs="Sakkal Majalla"/>
-                <w:b/>
-                <w:bCs/>
-                <w:color w:val="000000" w:themeColor="text1"/>
-                <w:rtl/>
-              </w:rPr>
-            </w:pPr>
-            <w:r>
-              <w:rPr>
-                <w:rFonts w:ascii="Sakkal Majalla" w:eastAsia="Sakkal Majalla" w:hAnsi="Sakkal Majalla" w:cs="Sakkal Majalla"/>
-                <w:b/>
-                <w:bCs/>
-                <w:color w:val="000000" w:themeColor="text1"/>
-                <w:rtl/>
-              </w:rPr>
-              <w:t>التعديل على الخطة</w:t>
+            <w:r>
+              <w:rPr>
+                <w:rFonts w:ascii="Simplified Arabic" w:hAnsi="Simplified Arabic" w:cs="Simplified Arabic"/>
+                <w:color w:val="000000" w:themeColor="text1"/>
+                <w:rtl/>
+              </w:rPr>
+              <w:t>${</w:t>
+            </w:r>
+            <w:r>
+              <w:rPr>
+                <w:rFonts w:ascii="Simplified Arabic" w:hAnsi="Simplified Arabic" w:cs="Simplified Arabic"/>
+                <w:color w:val="000000" w:themeColor="text1"/>
+              </w:rPr>
+              <w:t>skill_indicators</w:t>
+            </w:r>
+            <w:r>
+              <w:rPr>
+                <w:rFonts w:ascii="Simplified Arabic" w:hAnsi="Simplified Arabic" w:cs="Simplified Arabic"/>
+                <w:color w:val="000000" w:themeColor="text1"/>
+                <w:rtl/>
+              </w:rPr>
+              <w:t>}</w:t>
             </w:r>
           </w:p>
         </w:tc>
@@ -950,83 +801,30 @@
       <w:tr>
         <w:tc>
           <w:tcPr>
-            <w:tcW w:w="0" w:type="auto"/>
-            <w:hideMark/>
+            <w:tcW w:w="4392" w:type="dxa"/>
+            <w:vMerge/>
           </w:tcPr>
           <w:p>
             <w:pPr>
               <w:bidi/>
-              <w:spacing w:after="160" w:line="278" w:lineRule="auto"/>
               <w:rPr>
                 <w:rFonts w:ascii="Sakkal Majalla" w:eastAsia="Sakkal Majalla" w:hAnsi="Sakkal Majalla" w:cs="Sakkal Majalla"/>
-                <w:b/>
-                <w:bCs/>
-                <w:color w:val="000000" w:themeColor="text1"/>
-                <w:rtl/>
-              </w:rPr>
-            </w:pPr>
-            <w:r>
-              <w:rPr>
-                <w:rFonts w:ascii="Sakkal Majalla" w:eastAsia="Sakkal Majalla" w:hAnsi="Sakkal Majalla" w:cs="Sakkal Majalla"/>
-                <w:b/>
-                <w:bCs/>
-                <w:color w:val="000000" w:themeColor="text1"/>
-                <w:rtl/>
-              </w:rPr>
-              <w:t>مرضية (</w:t>
-            </w:r>
-            <w:r>
-              <w:rPr>
-                <w:rFonts w:ascii="Sakkal Majalla" w:eastAsia="Sakkal Majalla" w:hAnsi="Sakkal Majalla" w:cs="Sakkal Majalla"/>
-                <w:b/>
-                <w:bCs/>
-                <w:color w:val="000000" w:themeColor="text1"/>
+                <w:color w:val="000000" w:themeColor="text1"/>
+                <w:rtl/>
                 <w:lang w:bidi="ar-JO"/>
-              </w:rPr>
-              <w:t>Satisfactory</w:t>
-            </w:r>
-            <w:r>
-              <w:rPr>
-                <w:rFonts w:ascii="Sakkal Majalla" w:eastAsia="Sakkal Majalla" w:hAnsi="Sakkal Majalla" w:cs="Sakkal Majalla"/>
-                <w:b/>
-                <w:bCs/>
-                <w:color w:val="000000" w:themeColor="text1"/>
-                <w:rtl/>
-              </w:rPr>
-              <w:t>)</w:t>
-            </w:r>
-          </w:p>
-        </w:tc>
-        <w:tc>
-          <w:tcPr>
-            <w:tcW w:w="0" w:type="auto"/>
-          </w:tcPr>
-          <w:p>
-            <w:pPr>
-              <w:bidi/>
-              <w:spacing w:after="160" w:line="278" w:lineRule="auto"/>
-              <w:rPr>
-                <w:rFonts w:ascii="Sakkal Majalla" w:eastAsia="Sakkal Majalla" w:hAnsi="Sakkal Majalla" w:cs="Sakkal Majalla"/>
-                <w:b/>
-                <w:bCs/>
-                <w:color w:val="000000" w:themeColor="text1"/>
-                <w:rtl/>
               </w:rPr>
             </w:pPr>
           </w:p>
         </w:tc>
         <w:tc>
           <w:tcPr>
-            <w:tcW w:w="0" w:type="auto"/>
+            <w:tcW w:w="4392" w:type="dxa"/>
           </w:tcPr>
           <w:p>
             <w:pPr>
               <w:bidi/>
-              <w:spacing w:after="160" w:line="278" w:lineRule="auto"/>
-              <w:rPr>
-                <w:rFonts w:ascii="Sakkal Majalla" w:eastAsia="Sakkal Majalla" w:hAnsi="Sakkal Majalla" w:cs="Sakkal Majalla"/>
-                <w:b/>
-                <w:bCs/>
+              <w:rPr>
+                <w:rFonts w:ascii="Simplified Arabic" w:hAnsi="Simplified Arabic" w:cs="Simplified Arabic"/>
                 <w:color w:val="000000" w:themeColor="text1"/>
                 <w:rtl/>
               </w:rPr>
@@ -1035,16 +833,13 @@
         </w:tc>
         <w:tc>
           <w:tcPr>
-            <w:tcW w:w="0" w:type="auto"/>
+            <w:tcW w:w="4392" w:type="dxa"/>
           </w:tcPr>
           <w:p>
             <w:pPr>
               <w:bidi/>
-              <w:spacing w:after="160" w:line="278" w:lineRule="auto"/>
-              <w:rPr>
-                <w:rFonts w:ascii="Sakkal Majalla" w:eastAsia="Sakkal Majalla" w:hAnsi="Sakkal Majalla" w:cs="Sakkal Majalla"/>
-                <w:b/>
-                <w:bCs/>
+              <w:rPr>
+                <w:rFonts w:ascii="Simplified Arabic" w:hAnsi="Simplified Arabic" w:cs="Simplified Arabic"/>
                 <w:color w:val="000000" w:themeColor="text1"/>
                 <w:rtl/>
               </w:rPr>
@@ -1055,83 +850,30 @@
       <w:tr>
         <w:tc>
           <w:tcPr>
-            <w:tcW w:w="0" w:type="auto"/>
-            <w:hideMark/>
+            <w:tcW w:w="4392" w:type="dxa"/>
+            <w:vMerge/>
           </w:tcPr>
           <w:p>
             <w:pPr>
               <w:bidi/>
-              <w:spacing w:after="160" w:line="278" w:lineRule="auto"/>
               <w:rPr>
                 <w:rFonts w:ascii="Sakkal Majalla" w:eastAsia="Sakkal Majalla" w:hAnsi="Sakkal Majalla" w:cs="Sakkal Majalla"/>
-                <w:b/>
-                <w:bCs/>
-                <w:color w:val="000000" w:themeColor="text1"/>
-                <w:rtl/>
-              </w:rPr>
-            </w:pPr>
-            <w:r>
-              <w:rPr>
-                <w:rFonts w:ascii="Sakkal Majalla" w:eastAsia="Sakkal Majalla" w:hAnsi="Sakkal Majalla" w:cs="Sakkal Majalla"/>
-                <w:b/>
-                <w:bCs/>
-                <w:color w:val="000000" w:themeColor="text1"/>
-                <w:rtl/>
-              </w:rPr>
-              <w:t>محايدة / متوسطة (</w:t>
-            </w:r>
-            <w:r>
-              <w:rPr>
-                <w:rFonts w:ascii="Sakkal Majalla" w:eastAsia="Sakkal Majalla" w:hAnsi="Sakkal Majalla" w:cs="Sakkal Majalla"/>
-                <w:b/>
-                <w:bCs/>
-                <w:color w:val="000000" w:themeColor="text1"/>
+                <w:color w:val="000000" w:themeColor="text1"/>
+                <w:rtl/>
                 <w:lang w:bidi="ar-JO"/>
-              </w:rPr>
-              <w:t>Neutral</w:t>
-            </w:r>
-            <w:r>
-              <w:rPr>
-                <w:rFonts w:ascii="Sakkal Majalla" w:eastAsia="Sakkal Majalla" w:hAnsi="Sakkal Majalla" w:cs="Sakkal Majalla"/>
-                <w:b/>
-                <w:bCs/>
-                <w:color w:val="000000" w:themeColor="text1"/>
-                <w:rtl/>
-              </w:rPr>
-              <w:t>)</w:t>
-            </w:r>
-          </w:p>
-        </w:tc>
-        <w:tc>
-          <w:tcPr>
-            <w:tcW w:w="0" w:type="auto"/>
-          </w:tcPr>
-          <w:p>
-            <w:pPr>
-              <w:bidi/>
-              <w:spacing w:after="160" w:line="278" w:lineRule="auto"/>
-              <w:rPr>
-                <w:rFonts w:ascii="Sakkal Majalla" w:eastAsia="Sakkal Majalla" w:hAnsi="Sakkal Majalla" w:cs="Sakkal Majalla"/>
-                <w:b/>
-                <w:bCs/>
-                <w:color w:val="000000" w:themeColor="text1"/>
-                <w:rtl/>
               </w:rPr>
             </w:pPr>
           </w:p>
         </w:tc>
         <w:tc>
           <w:tcPr>
-            <w:tcW w:w="0" w:type="auto"/>
+            <w:tcW w:w="4392" w:type="dxa"/>
           </w:tcPr>
           <w:p>
             <w:pPr>
               <w:bidi/>
-              <w:spacing w:after="160" w:line="278" w:lineRule="auto"/>
-              <w:rPr>
-                <w:rFonts w:ascii="Sakkal Majalla" w:eastAsia="Sakkal Majalla" w:hAnsi="Sakkal Majalla" w:cs="Sakkal Majalla"/>
-                <w:b/>
-                <w:bCs/>
+              <w:rPr>
+                <w:rFonts w:ascii="Simplified Arabic" w:hAnsi="Simplified Arabic" w:cs="Simplified Arabic"/>
                 <w:color w:val="000000" w:themeColor="text1"/>
                 <w:rtl/>
               </w:rPr>
@@ -1140,16 +882,13 @@
         </w:tc>
         <w:tc>
           <w:tcPr>
-            <w:tcW w:w="0" w:type="auto"/>
+            <w:tcW w:w="4392" w:type="dxa"/>
           </w:tcPr>
           <w:p>
             <w:pPr>
               <w:bidi/>
-              <w:spacing w:after="160" w:line="278" w:lineRule="auto"/>
-              <w:rPr>
-                <w:rFonts w:ascii="Sakkal Majalla" w:eastAsia="Sakkal Majalla" w:hAnsi="Sakkal Majalla" w:cs="Sakkal Majalla"/>
-                <w:b/>
-                <w:bCs/>
+              <w:rPr>
+                <w:rFonts w:ascii="Simplified Arabic" w:hAnsi="Simplified Arabic" w:cs="Simplified Arabic"/>
                 <w:color w:val="000000" w:themeColor="text1"/>
                 <w:rtl/>
               </w:rPr>
@@ -1160,109 +899,242 @@
       <w:tr>
         <w:tc>
           <w:tcPr>
-            <w:tcW w:w="0" w:type="auto"/>
-            <w:hideMark/>
+            <w:tcW w:w="4392" w:type="dxa"/>
           </w:tcPr>
           <w:p>
             <w:pPr>
               <w:bidi/>
-              <w:spacing w:after="160" w:line="278" w:lineRule="auto"/>
               <w:rPr>
                 <w:rFonts w:ascii="Sakkal Majalla" w:eastAsia="Sakkal Majalla" w:hAnsi="Sakkal Majalla" w:cs="Sakkal Majalla"/>
-                <w:b/>
-                <w:bCs/>
-                <w:color w:val="000000" w:themeColor="text1"/>
-                <w:rtl/>
+                <w:color w:val="000000" w:themeColor="text1"/>
+                <w:rtl/>
+                <w:lang w:bidi="ar-JO"/>
               </w:rPr>
             </w:pPr>
             <w:r>
               <w:rPr>
                 <w:rFonts w:ascii="Sakkal Majalla" w:eastAsia="Sakkal Majalla" w:hAnsi="Sakkal Majalla" w:cs="Sakkal Majalla"/>
-                <w:b/>
-                <w:bCs/>
-                <w:color w:val="000000" w:themeColor="text1"/>
-                <w:rtl/>
-              </w:rPr>
-              <w:t>غير مرضية (</w:t>
-            </w:r>
-            <w:r>
-              <w:rPr>
-                <w:rFonts w:ascii="Sakkal Majalla" w:eastAsia="Sakkal Majalla" w:hAnsi="Sakkal Majalla" w:cs="Sakkal Majalla"/>
-                <w:b/>
-                <w:bCs/>
-                <w:color w:val="000000" w:themeColor="text1"/>
+                <w:color w:val="000000" w:themeColor="text1"/>
+                <w:rtl/>
                 <w:lang w:bidi="ar-JO"/>
               </w:rPr>
-              <w:t>Unsatisfactory</w:t>
-            </w:r>
-            <w:r>
-              <w:rPr>
-                <w:rFonts w:ascii="Sakkal Majalla" w:eastAsia="Sakkal Majalla" w:hAnsi="Sakkal Majalla" w:cs="Sakkal Majalla"/>
-                <w:b/>
-                <w:bCs/>
-                <w:color w:val="000000" w:themeColor="text1"/>
-                <w:rtl/>
-              </w:rPr>
-              <w:t>)</w:t>
+              <w:t>طريقة التقويم لكل نتاج</w:t>
             </w:r>
           </w:p>
         </w:tc>
         <w:tc>
           <w:tcPr>
-            <w:tcW w:w="0" w:type="auto"/>
+            <w:tcW w:w="4392" w:type="dxa"/>
           </w:tcPr>
           <w:p>
             <w:pPr>
               <w:bidi/>
-              <w:spacing w:after="160" w:line="278" w:lineRule="auto"/>
-              <w:rPr>
-                <w:rFonts w:ascii="Sakkal Majalla" w:eastAsia="Sakkal Majalla" w:hAnsi="Sakkal Majalla" w:cs="Sakkal Majalla"/>
-                <w:b/>
-                <w:bCs/>
+              <w:rPr>
+                <w:rFonts w:ascii="Simplified Arabic" w:hAnsi="Simplified Arabic" w:cs="Simplified Arabic"/>
                 <w:color w:val="000000" w:themeColor="text1"/>
                 <w:rtl/>
               </w:rPr>
             </w:pPr>
+            <w:r>
+              <w:rPr>
+                <w:rFonts w:ascii="Simplified Arabic" w:hAnsi="Simplified Arabic" w:cs="Simplified Arabic"/>
+                <w:color w:val="000000" w:themeColor="text1"/>
+                <w:rtl/>
+              </w:rPr>
+              <w:t>${</w:t>
+            </w:r>
+            <w:r>
+              <w:rPr>
+                <w:rFonts w:ascii="Simplified Arabic" w:hAnsi="Simplified Arabic" w:cs="Simplified Arabic"/>
+                <w:color w:val="000000" w:themeColor="text1"/>
+              </w:rPr>
+              <w:t>cognitive_evaluation</w:t>
+            </w:r>
+            <w:r>
+              <w:rPr>
+                <w:rFonts w:ascii="Simplified Arabic" w:hAnsi="Simplified Arabic" w:cs="Simplified Arabic"/>
+                <w:color w:val="000000" w:themeColor="text1"/>
+                <w:rtl/>
+              </w:rPr>
+              <w:t>}</w:t>
+            </w:r>
           </w:p>
         </w:tc>
         <w:tc>
           <w:tcPr>
-            <w:tcW w:w="0" w:type="auto"/>
+            <w:tcW w:w="4392" w:type="dxa"/>
+          </w:tcPr>
+          <w:p>
+            <w:pPr>
+              <w:tabs>
+                <w:tab w:val="left" w:pos="1536"/>
+              </w:tabs>
+              <w:bidi/>
+              <w:rPr>
+                <w:rFonts w:ascii="Simplified Arabic" w:hAnsi="Simplified Arabic" w:cs="Simplified Arabic"/>
+                <w:color w:val="000000" w:themeColor="text1"/>
+                <w:rtl/>
+              </w:rPr>
+            </w:pPr>
+            <w:r>
+              <w:rPr>
+                <w:rFonts w:ascii="Simplified Arabic" w:hAnsi="Simplified Arabic" w:cs="Simplified Arabic"/>
+                <w:color w:val="000000" w:themeColor="text1"/>
+                <w:rtl/>
+              </w:rPr>
+              <w:t>${</w:t>
+            </w:r>
+            <w:r>
+              <w:rPr>
+                <w:rFonts w:ascii="Simplified Arabic" w:hAnsi="Simplified Arabic" w:cs="Simplified Arabic"/>
+                <w:color w:val="000000" w:themeColor="text1"/>
+              </w:rPr>
+              <w:t>skill_evaluation</w:t>
+            </w:r>
+            <w:r>
+              <w:rPr>
+                <w:rFonts w:ascii="Simplified Arabic" w:hAnsi="Simplified Arabic" w:cs="Simplified Arabic"/>
+                <w:color w:val="000000" w:themeColor="text1"/>
+                <w:rtl/>
+              </w:rPr>
+              <w:t>}</w:t>
+            </w:r>
+          </w:p>
+        </w:tc>
+      </w:tr>
+      <w:tr>
+        <w:trPr>
+          <w:trHeight w:val="300"/>
+        </w:trPr>
+        <w:tc>
+          <w:tcPr>
+            <w:tcW w:w="4392" w:type="dxa"/>
           </w:tcPr>
           <w:p>
             <w:pPr>
               <w:bidi/>
-              <w:spacing w:after="160" w:line="278" w:lineRule="auto"/>
               <w:rPr>
                 <w:rFonts w:ascii="Sakkal Majalla" w:eastAsia="Sakkal Majalla" w:hAnsi="Sakkal Majalla" w:cs="Sakkal Majalla"/>
-                <w:b/>
-                <w:bCs/>
-                <w:color w:val="000000" w:themeColor="text1"/>
-                <w:rtl/>
+                <w:color w:val="000000" w:themeColor="text1"/>
+                <w:rtl/>
+                <w:lang w:bidi="ar-JO"/>
               </w:rPr>
             </w:pPr>
+            <w:r>
+              <w:rPr>
+                <w:rFonts w:ascii="Sakkal Majalla" w:eastAsia="Sakkal Majalla" w:hAnsi="Sakkal Majalla" w:cs="Sakkal Majalla"/>
+                <w:color w:val="000000" w:themeColor="text1"/>
+                <w:rtl/>
+                <w:lang w:bidi="ar-JO"/>
+              </w:rPr>
+              <w:t xml:space="preserve">طريقة التدريس / النشاط التعليمي التعلمي </w:t>
+            </w:r>
           </w:p>
         </w:tc>
         <w:tc>
           <w:tcPr>
-            <w:tcW w:w="0" w:type="auto"/>
+            <w:tcW w:w="4392" w:type="dxa"/>
           </w:tcPr>
           <w:p>
             <w:pPr>
               <w:bidi/>
-              <w:spacing w:after="160" w:line="278" w:lineRule="auto"/>
-              <w:rPr>
-                <w:rFonts w:ascii="Sakkal Majalla" w:eastAsia="Sakkal Majalla" w:hAnsi="Sakkal Majalla" w:cs="Sakkal Majalla"/>
-                <w:b/>
-                <w:bCs/>
+              <w:rPr>
+                <w:rFonts w:ascii="Simplified Arabic" w:hAnsi="Simplified Arabic" w:cs="Simplified Arabic"/>
                 <w:color w:val="000000" w:themeColor="text1"/>
                 <w:rtl/>
               </w:rPr>
             </w:pPr>
+            <w:r>
+              <w:rPr>
+                <w:rFonts w:ascii="Simplified Arabic" w:hAnsi="Simplified Arabic" w:cs="Simplified Arabic"/>
+                <w:color w:val="000000" w:themeColor="text1"/>
+                <w:rtl/>
+              </w:rPr>
+              <w:t>${</w:t>
+            </w:r>
+            <w:r>
+              <w:rPr>
+                <w:rFonts w:ascii="Simplified Arabic" w:hAnsi="Simplified Arabic" w:cs="Simplified Arabic"/>
+                <w:color w:val="000000" w:themeColor="text1"/>
+              </w:rPr>
+              <w:t>cognitive_teaching</w:t>
+            </w:r>
+            <w:r>
+              <w:rPr>
+                <w:rFonts w:ascii="Simplified Arabic" w:hAnsi="Simplified Arabic" w:cs="Simplified Arabic"/>
+                <w:color w:val="000000" w:themeColor="text1"/>
+                <w:rtl/>
+              </w:rPr>
+              <w:t>}</w:t>
+            </w:r>
+          </w:p>
+        </w:tc>
+        <w:tc>
+          <w:tcPr>
+            <w:tcW w:w="4392" w:type="dxa"/>
+          </w:tcPr>
+          <w:p>
+            <w:pPr>
+              <w:bidi/>
+              <w:rPr>
+                <w:rFonts w:ascii="Simplified Arabic" w:hAnsi="Simplified Arabic" w:cs="Simplified Arabic"/>
+                <w:color w:val="000000" w:themeColor="text1"/>
+                <w:rtl/>
+              </w:rPr>
+            </w:pPr>
+            <w:r>
+              <w:rPr>
+                <w:rFonts w:ascii="Simplified Arabic" w:hAnsi="Simplified Arabic" w:cs="Simplified Arabic"/>
+                <w:color w:val="000000" w:themeColor="text1"/>
+                <w:rtl/>
+              </w:rPr>
+              <w:t>${</w:t>
+            </w:r>
+            <w:r>
+              <w:rPr>
+                <w:rFonts w:ascii="Simplified Arabic" w:hAnsi="Simplified Arabic" w:cs="Simplified Arabic"/>
+                <w:color w:val="000000" w:themeColor="text1"/>
+              </w:rPr>
+              <w:t>skill_teaching</w:t>
+            </w:r>
+            <w:r>
+              <w:rPr>
+                <w:rFonts w:ascii="Simplified Arabic" w:hAnsi="Simplified Arabic" w:cs="Simplified Arabic"/>
+                <w:color w:val="000000" w:themeColor="text1"/>
+                <w:rtl/>
+              </w:rPr>
+              <w:t>}</w:t>
+            </w:r>
           </w:p>
         </w:tc>
       </w:tr>
     </w:tbl>
+    <w:p>
+      <w:pPr>
+        <w:bidi/>
+        <w:rPr>
+          <w:rFonts w:ascii="Sakkal Majalla" w:eastAsia="Sakkal Majalla" w:hAnsi="Sakkal Majalla" w:cs="Sakkal Majalla"/>
+          <w:b/>
+          <w:bCs/>
+          <w:color w:val="996633"/>
+          <w:sz w:val="28"/>
+          <w:szCs w:val="28"/>
+          <w:rtl/>
+        </w:rPr>
+      </w:pPr>
+      <w:r>
+        <w:rPr>
+          <w:rFonts w:ascii="Sakkal Majalla" w:eastAsia="Sakkal Majalla" w:hAnsi="Sakkal Majalla" w:cs="Sakkal Majalla"/>
+          <w:b/>
+          <w:bCs/>
+          <w:color w:val="996633"/>
+          <w:sz w:val="28"/>
+          <w:szCs w:val="28"/>
+          <w:rtl/>
+        </w:rPr>
+        <w:br w:type="page"/>
+      </w:r>
+    </w:p>
     <w:p>
       <w:pPr>
         <w:bidi/>
@@ -1271,13 +1143,636 @@
           <w:b/>
           <w:bCs/>
           <w:color w:val="000000" w:themeColor="text1"/>
+          <w:sz w:val="28"/>
+          <w:szCs w:val="28"/>
+        </w:rPr>
+      </w:pPr>
+      <w:r>
+        <w:rPr>
+          <w:rFonts w:ascii="Sakkal Majalla" w:eastAsia="Sakkal Majalla" w:hAnsi="Sakkal Majalla" w:cs="Sakkal Majalla" w:hint="cs"/>
+          <w:b/>
+          <w:bCs/>
+          <w:color w:val="000000" w:themeColor="text1"/>
+          <w:sz w:val="28"/>
+          <w:szCs w:val="28"/>
           <w:rtl/>
         </w:rPr>
+        <w:lastRenderedPageBreak/>
+        <w:t>الممارسة التأملية:</w:t>
+      </w:r>
+    </w:p>
+    <w:tbl>
+      <w:tblPr>
+        <w:tblStyle w:val="TableGrid"/>
+        <w:bidiVisual/>
+        <w:tblW w:w="14226" w:type="dxa"/>
+        <w:tblInd w:w="-606" w:type="dxa"/>
+        <w:tblLook w:val="04A0" w:firstRow="1" w:lastRow="0" w:firstColumn="1" w:lastColumn="0" w:noHBand="0" w:noVBand="1"/>
+      </w:tblPr>
+      <w:tblGrid>
+        <w:gridCol w:w="3178"/>
+        <w:gridCol w:w="3747"/>
+        <w:gridCol w:w="3987"/>
+        <w:gridCol w:w="3314"/>
+      </w:tblGrid>
+      <w:tr>
+        <w:tc>
+          <w:tcPr>
+            <w:tcW w:w="5946" w:type="dxa"/>
+            <w:shd w:val="clear" w:color="auto" w:fill="D9D9D9" w:themeFill="background1" w:themeFillShade="D9"/>
+          </w:tcPr>
+          <w:p>
+            <w:pPr>
+              <w:bidi/>
+              <w:jc w:val="center"/>
+              <w:rPr>
+                <w:rFonts w:ascii="Sakkal Majalla" w:eastAsia="Sakkal Majalla" w:hAnsi="Sakkal Majalla" w:cs="Sakkal Majalla"/>
+                <w:b/>
+                <w:bCs/>
+                <w:color w:val="000000" w:themeColor="text1"/>
+                <w:lang w:bidi="ar-JO"/>
+              </w:rPr>
+            </w:pPr>
+            <w:r>
+              <w:rPr>
+                <w:rFonts w:ascii="Sakkal Majalla" w:eastAsia="Sakkal Majalla" w:hAnsi="Sakkal Majalla" w:cs="Sakkal Majalla"/>
+                <w:b/>
+                <w:bCs/>
+                <w:color w:val="000000" w:themeColor="text1"/>
+                <w:rtl/>
+                <w:lang w:bidi="ar-JO"/>
+              </w:rPr>
+              <w:t xml:space="preserve">الحالة التقويمية </w:t>
+            </w:r>
+          </w:p>
+        </w:tc>
+        <w:tc>
+          <w:tcPr>
+            <w:tcW w:w="2790" w:type="dxa"/>
+            <w:shd w:val="clear" w:color="auto" w:fill="D9D9D9" w:themeFill="background1" w:themeFillShade="D9"/>
+          </w:tcPr>
+          <w:p>
+            <w:pPr>
+              <w:bidi/>
+              <w:jc w:val="center"/>
+              <w:rPr>
+                <w:rFonts w:ascii="Sakkal Majalla" w:eastAsia="Sakkal Majalla" w:hAnsi="Sakkal Majalla" w:cs="Sakkal Majalla"/>
+                <w:b/>
+                <w:bCs/>
+                <w:color w:val="000000" w:themeColor="text1"/>
+                <w:rtl/>
+                <w:lang w:bidi="ar-JO"/>
+              </w:rPr>
+            </w:pPr>
+            <w:r>
+              <w:rPr>
+                <w:rFonts w:ascii="Sakkal Majalla" w:eastAsia="Sakkal Majalla" w:hAnsi="Sakkal Majalla" w:cs="Sakkal Majalla"/>
+                <w:b/>
+                <w:bCs/>
+                <w:color w:val="000000" w:themeColor="text1"/>
+                <w:rtl/>
+                <w:lang w:bidi="ar-JO"/>
+              </w:rPr>
+              <w:t>نتائج مرضية</w:t>
+            </w:r>
+          </w:p>
+        </w:tc>
+        <w:tc>
+          <w:tcPr>
+            <w:tcW w:w="2730" w:type="dxa"/>
+            <w:shd w:val="clear" w:color="auto" w:fill="D9D9D9" w:themeFill="background1" w:themeFillShade="D9"/>
+          </w:tcPr>
+          <w:p>
+            <w:pPr>
+              <w:bidi/>
+              <w:jc w:val="center"/>
+              <w:rPr>
+                <w:rFonts w:ascii="Sakkal Majalla" w:eastAsia="Sakkal Majalla" w:hAnsi="Sakkal Majalla" w:cs="Sakkal Majalla"/>
+                <w:b/>
+                <w:bCs/>
+                <w:color w:val="000000" w:themeColor="text1"/>
+                <w:rtl/>
+                <w:lang w:bidi="ar-JO"/>
+              </w:rPr>
+            </w:pPr>
+            <w:r>
+              <w:rPr>
+                <w:rFonts w:ascii="Sakkal Majalla" w:eastAsia="Sakkal Majalla" w:hAnsi="Sakkal Majalla" w:cs="Sakkal Majalla"/>
+                <w:b/>
+                <w:bCs/>
+                <w:color w:val="000000" w:themeColor="text1"/>
+                <w:rtl/>
+                <w:lang w:bidi="ar-JO"/>
+              </w:rPr>
+              <w:t>نتائج غير مرضية</w:t>
+            </w:r>
+          </w:p>
+        </w:tc>
+        <w:tc>
+          <w:tcPr>
+            <w:tcW w:w="2760" w:type="dxa"/>
+            <w:shd w:val="clear" w:color="auto" w:fill="D9D9D9" w:themeFill="background1" w:themeFillShade="D9"/>
+          </w:tcPr>
+          <w:p>
+            <w:pPr>
+              <w:bidi/>
+              <w:jc w:val="center"/>
+              <w:rPr>
+                <w:rFonts w:ascii="Sakkal Majalla" w:eastAsia="Sakkal Majalla" w:hAnsi="Sakkal Majalla" w:cs="Sakkal Majalla"/>
+                <w:b/>
+                <w:bCs/>
+                <w:color w:val="000000" w:themeColor="text1"/>
+                <w:rtl/>
+                <w:lang w:bidi="ar-JO"/>
+              </w:rPr>
+            </w:pPr>
+            <w:r>
+              <w:rPr>
+                <w:rFonts w:ascii="Sakkal Majalla" w:eastAsia="Sakkal Majalla" w:hAnsi="Sakkal Majalla" w:cs="Sakkal Majalla"/>
+                <w:b/>
+                <w:bCs/>
+                <w:color w:val="000000" w:themeColor="text1"/>
+                <w:rtl/>
+                <w:lang w:bidi="ar-JO"/>
+              </w:rPr>
+              <w:t>نتائج محايدة</w:t>
+            </w:r>
+          </w:p>
+        </w:tc>
+      </w:tr>
+      <w:tr>
+        <w:tc>
+          <w:tcPr>
+            <w:tcW w:w="5946" w:type="dxa"/>
+          </w:tcPr>
+          <w:p>
+            <w:pPr>
+              <w:bidi/>
+              <w:rPr>
+                <w:rFonts w:ascii="Sakkal Majalla" w:eastAsia="Sakkal Majalla" w:hAnsi="Sakkal Majalla" w:cs="Sakkal Majalla"/>
+                <w:color w:val="000000" w:themeColor="text1"/>
+                <w:rtl/>
+              </w:rPr>
+            </w:pPr>
+            <w:r>
+              <w:rPr>
+                <w:rFonts w:ascii="Sakkal Majalla" w:eastAsia="Sakkal Majalla" w:hAnsi="Sakkal Majalla" w:cs="Sakkal Majalla"/>
+                <w:color w:val="000000" w:themeColor="text1"/>
+                <w:rtl/>
+              </w:rPr>
+              <w:t>كيف سيتم التعامل مع البيانات الناتجة عن عملية التقويم؟ </w:t>
+            </w:r>
+          </w:p>
+        </w:tc>
+        <w:tc>
+          <w:tcPr>
+            <w:tcW w:w="2790" w:type="dxa"/>
+          </w:tcPr>
+          <w:p>
+            <w:pPr>
+              <w:bidi/>
+              <w:rPr>
+                <w:rFonts w:ascii="Simplified Arabic" w:hAnsi="Simplified Arabic" w:cs="Simplified Arabic"/>
+                <w:color w:val="000000" w:themeColor="text1"/>
+                <w:rtl/>
+              </w:rPr>
+            </w:pPr>
+            <w:r>
+              <w:rPr>
+                <w:rFonts w:ascii="Simplified Arabic" w:hAnsi="Simplified Arabic" w:cs="Simplified Arabic"/>
+                <w:color w:val="000000" w:themeColor="text1"/>
+                <w:rtl/>
+              </w:rPr>
+              <w:t>${</w:t>
+            </w:r>
+            <w:r>
+              <w:rPr>
+                <w:rFonts w:ascii="Simplified Arabic" w:hAnsi="Simplified Arabic" w:cs="Simplified Arabic"/>
+                <w:color w:val="000000" w:themeColor="text1"/>
+              </w:rPr>
+              <w:t>reflection_satisfactory_deal</w:t>
+            </w:r>
+            <w:r>
+              <w:rPr>
+                <w:rFonts w:ascii="Simplified Arabic" w:hAnsi="Simplified Arabic" w:cs="Simplified Arabic"/>
+                <w:color w:val="000000" w:themeColor="text1"/>
+                <w:rtl/>
+              </w:rPr>
+              <w:t>}</w:t>
+            </w:r>
+          </w:p>
+        </w:tc>
+        <w:tc>
+          <w:tcPr>
+            <w:tcW w:w="2730" w:type="dxa"/>
+          </w:tcPr>
+          <w:p>
+            <w:pPr>
+              <w:bidi/>
+              <w:rPr>
+                <w:rFonts w:ascii="Simplified Arabic" w:hAnsi="Simplified Arabic" w:cs="Simplified Arabic"/>
+                <w:color w:val="000000" w:themeColor="text1"/>
+                <w:rtl/>
+              </w:rPr>
+            </w:pPr>
+            <w:r>
+              <w:rPr>
+                <w:rFonts w:ascii="Simplified Arabic" w:hAnsi="Simplified Arabic" w:cs="Simplified Arabic"/>
+                <w:color w:val="000000" w:themeColor="text1"/>
+                <w:rtl/>
+              </w:rPr>
+              <w:t>${</w:t>
+            </w:r>
+            <w:r>
+              <w:rPr>
+                <w:rFonts w:ascii="Simplified Arabic" w:hAnsi="Simplified Arabic" w:cs="Simplified Arabic"/>
+                <w:color w:val="000000" w:themeColor="text1"/>
+              </w:rPr>
+              <w:t>reflection_unsatisfactory_deal</w:t>
+            </w:r>
+            <w:r>
+              <w:rPr>
+                <w:rFonts w:ascii="Simplified Arabic" w:hAnsi="Simplified Arabic" w:cs="Simplified Arabic"/>
+                <w:color w:val="000000" w:themeColor="text1"/>
+                <w:rtl/>
+              </w:rPr>
+              <w:t>}</w:t>
+            </w:r>
+          </w:p>
+        </w:tc>
+        <w:tc>
+          <w:tcPr>
+            <w:tcW w:w="2760" w:type="dxa"/>
+          </w:tcPr>
+          <w:p>
+            <w:pPr>
+              <w:bidi/>
+              <w:rPr>
+                <w:rFonts w:ascii="Simplified Arabic" w:hAnsi="Simplified Arabic" w:cs="Simplified Arabic"/>
+                <w:color w:val="000000" w:themeColor="text1"/>
+                <w:rtl/>
+              </w:rPr>
+            </w:pPr>
+            <w:r>
+              <w:rPr>
+                <w:rFonts w:ascii="Simplified Arabic" w:hAnsi="Simplified Arabic" w:cs="Simplified Arabic"/>
+                <w:color w:val="000000" w:themeColor="text1"/>
+                <w:rtl/>
+              </w:rPr>
+              <w:t>${</w:t>
+            </w:r>
+            <w:r>
+              <w:rPr>
+                <w:rFonts w:ascii="Simplified Arabic" w:hAnsi="Simplified Arabic" w:cs="Simplified Arabic"/>
+                <w:color w:val="000000" w:themeColor="text1"/>
+              </w:rPr>
+              <w:t>reflection_neutral_deal</w:t>
+            </w:r>
+            <w:r>
+              <w:rPr>
+                <w:rFonts w:ascii="Simplified Arabic" w:hAnsi="Simplified Arabic" w:cs="Simplified Arabic"/>
+                <w:color w:val="000000" w:themeColor="text1"/>
+                <w:rtl/>
+              </w:rPr>
+              <w:t>}</w:t>
+            </w:r>
+          </w:p>
+        </w:tc>
+      </w:tr>
+      <w:tr>
+        <w:tc>
+          <w:tcPr>
+            <w:tcW w:w="5946" w:type="dxa"/>
+          </w:tcPr>
+          <w:p>
+            <w:pPr>
+              <w:bidi/>
+              <w:rPr>
+                <w:rFonts w:ascii="Sakkal Majalla" w:eastAsia="Sakkal Majalla" w:hAnsi="Sakkal Majalla" w:cs="Sakkal Majalla"/>
+                <w:color w:val="000000" w:themeColor="text1"/>
+                <w:rtl/>
+              </w:rPr>
+            </w:pPr>
+            <w:r>
+              <w:rPr>
+                <w:rFonts w:ascii="Sakkal Majalla" w:eastAsia="Sakkal Majalla" w:hAnsi="Sakkal Majalla" w:cs="Sakkal Majalla"/>
+                <w:color w:val="000000" w:themeColor="text1"/>
+                <w:rtl/>
+              </w:rPr>
+              <w:t>ما القرارات التي سيتم اتخاذها لتحسين العملية التعليمية في ضوء هذه البيانات؟  </w:t>
+            </w:r>
+          </w:p>
+        </w:tc>
+        <w:tc>
+          <w:tcPr>
+            <w:tcW w:w="2790" w:type="dxa"/>
+          </w:tcPr>
+          <w:p>
+            <w:pPr>
+              <w:bidi/>
+              <w:rPr>
+                <w:rFonts w:ascii="Simplified Arabic" w:hAnsi="Simplified Arabic" w:cs="Simplified Arabic"/>
+                <w:color w:val="000000" w:themeColor="text1"/>
+                <w:rtl/>
+              </w:rPr>
+            </w:pPr>
+            <w:r>
+              <w:rPr>
+                <w:rFonts w:ascii="Simplified Arabic" w:hAnsi="Simplified Arabic" w:cs="Simplified Arabic"/>
+                <w:color w:val="000000" w:themeColor="text1"/>
+                <w:rtl/>
+              </w:rPr>
+              <w:t>${</w:t>
+            </w:r>
+            <w:r>
+              <w:rPr>
+                <w:rFonts w:ascii="Simplified Arabic" w:hAnsi="Simplified Arabic" w:cs="Simplified Arabic"/>
+                <w:color w:val="000000" w:themeColor="text1"/>
+              </w:rPr>
+              <w:t>reflection_satisfactory_decision</w:t>
+            </w:r>
+            <w:r>
+              <w:rPr>
+                <w:rFonts w:ascii="Simplified Arabic" w:hAnsi="Simplified Arabic" w:cs="Simplified Arabic"/>
+                <w:color w:val="000000" w:themeColor="text1"/>
+                <w:rtl/>
+              </w:rPr>
+              <w:t>}</w:t>
+            </w:r>
+          </w:p>
+        </w:tc>
+        <w:tc>
+          <w:tcPr>
+            <w:tcW w:w="2730" w:type="dxa"/>
+          </w:tcPr>
+          <w:p>
+            <w:pPr>
+              <w:bidi/>
+              <w:rPr>
+                <w:rFonts w:ascii="Simplified Arabic" w:hAnsi="Simplified Arabic" w:cs="Simplified Arabic"/>
+                <w:color w:val="000000" w:themeColor="text1"/>
+                <w:rtl/>
+              </w:rPr>
+            </w:pPr>
+            <w:r>
+              <w:rPr>
+                <w:rFonts w:ascii="Simplified Arabic" w:hAnsi="Simplified Arabic" w:cs="Simplified Arabic"/>
+                <w:color w:val="000000" w:themeColor="text1"/>
+                <w:rtl/>
+              </w:rPr>
+              <w:t>${</w:t>
+            </w:r>
+            <w:r>
+              <w:rPr>
+                <w:rFonts w:ascii="Simplified Arabic" w:hAnsi="Simplified Arabic" w:cs="Simplified Arabic"/>
+                <w:color w:val="000000" w:themeColor="text1"/>
+              </w:rPr>
+              <w:t>reflection_unsatisfactory_decision</w:t>
+            </w:r>
+            <w:r>
+              <w:rPr>
+                <w:rFonts w:ascii="Simplified Arabic" w:hAnsi="Simplified Arabic" w:cs="Simplified Arabic"/>
+                <w:color w:val="000000" w:themeColor="text1"/>
+                <w:rtl/>
+              </w:rPr>
+              <w:t>}</w:t>
+            </w:r>
+          </w:p>
+        </w:tc>
+        <w:tc>
+          <w:tcPr>
+            <w:tcW w:w="2760" w:type="dxa"/>
+          </w:tcPr>
+          <w:p>
+            <w:pPr>
+              <w:bidi/>
+              <w:rPr>
+                <w:rFonts w:ascii="Simplified Arabic" w:hAnsi="Simplified Arabic" w:cs="Simplified Arabic"/>
+                <w:color w:val="000000" w:themeColor="text1"/>
+                <w:rtl/>
+              </w:rPr>
+            </w:pPr>
+            <w:r>
+              <w:rPr>
+                <w:rFonts w:ascii="Simplified Arabic" w:hAnsi="Simplified Arabic" w:cs="Simplified Arabic"/>
+                <w:color w:val="000000" w:themeColor="text1"/>
+                <w:rtl/>
+              </w:rPr>
+              <w:t>${</w:t>
+            </w:r>
+            <w:r>
+              <w:rPr>
+                <w:rFonts w:ascii="Simplified Arabic" w:hAnsi="Simplified Arabic" w:cs="Simplified Arabic"/>
+                <w:color w:val="000000" w:themeColor="text1"/>
+              </w:rPr>
+              <w:t>reflection_neutral_decision</w:t>
+            </w:r>
+            <w:r>
+              <w:rPr>
+                <w:rFonts w:ascii="Simplified Arabic" w:hAnsi="Simplified Arabic" w:cs="Simplified Arabic"/>
+                <w:color w:val="000000" w:themeColor="text1"/>
+                <w:rtl/>
+              </w:rPr>
+              <w:t>}</w:t>
+            </w:r>
+          </w:p>
+        </w:tc>
+      </w:tr>
+      <w:tr>
+        <w:tc>
+          <w:tcPr>
+            <w:tcW w:w="5946" w:type="dxa"/>
+          </w:tcPr>
+          <w:p>
+            <w:pPr>
+              <w:bidi/>
+              <w:rPr>
+                <w:rFonts w:ascii="Sakkal Majalla" w:eastAsia="Sakkal Majalla" w:hAnsi="Sakkal Majalla" w:cs="Sakkal Majalla"/>
+                <w:color w:val="000000" w:themeColor="text1"/>
+                <w:rtl/>
+              </w:rPr>
+            </w:pPr>
+            <w:r>
+              <w:rPr>
+                <w:rFonts w:ascii="Sakkal Majalla" w:eastAsia="Sakkal Majalla" w:hAnsi="Sakkal Majalla" w:cs="Sakkal Majalla"/>
+                <w:color w:val="000000" w:themeColor="text1"/>
+                <w:rtl/>
+              </w:rPr>
+              <w:t>ما التعديلات التي ستجريها على مدخلات عناصر عمليتي التعليم والتقويم في ضوء مستوى أداء الطلبة ونتاجات التعلم المطلوب تحقيقها </w:t>
+            </w:r>
+          </w:p>
+        </w:tc>
+        <w:tc>
+          <w:tcPr>
+            <w:tcW w:w="2790" w:type="dxa"/>
+          </w:tcPr>
+          <w:p>
+            <w:pPr>
+              <w:bidi/>
+              <w:rPr>
+                <w:rFonts w:ascii="Simplified Arabic" w:hAnsi="Simplified Arabic" w:cs="Simplified Arabic"/>
+                <w:color w:val="000000" w:themeColor="text1"/>
+                <w:rtl/>
+              </w:rPr>
+            </w:pPr>
+            <w:r>
+              <w:rPr>
+                <w:rFonts w:ascii="Simplified Arabic" w:hAnsi="Simplified Arabic" w:cs="Simplified Arabic"/>
+                <w:color w:val="000000" w:themeColor="text1"/>
+                <w:rtl/>
+              </w:rPr>
+              <w:t>${</w:t>
+            </w:r>
+            <w:r>
+              <w:rPr>
+                <w:rFonts w:ascii="Simplified Arabic" w:hAnsi="Simplified Arabic" w:cs="Simplified Arabic"/>
+                <w:color w:val="000000" w:themeColor="text1"/>
+              </w:rPr>
+              <w:t>reflection_satisfactory_adjustment</w:t>
+            </w:r>
+            <w:r>
+              <w:rPr>
+                <w:rFonts w:ascii="Simplified Arabic" w:hAnsi="Simplified Arabic" w:cs="Simplified Arabic"/>
+                <w:color w:val="000000" w:themeColor="text1"/>
+                <w:rtl/>
+              </w:rPr>
+              <w:t>}</w:t>
+            </w:r>
+          </w:p>
+        </w:tc>
+        <w:tc>
+          <w:tcPr>
+            <w:tcW w:w="2730" w:type="dxa"/>
+          </w:tcPr>
+          <w:p>
+            <w:pPr>
+              <w:bidi/>
+              <w:rPr>
+                <w:rFonts w:ascii="Simplified Arabic" w:hAnsi="Simplified Arabic" w:cs="Simplified Arabic"/>
+                <w:color w:val="000000" w:themeColor="text1"/>
+                <w:rtl/>
+              </w:rPr>
+            </w:pPr>
+            <w:r>
+              <w:rPr>
+                <w:rFonts w:ascii="Simplified Arabic" w:hAnsi="Simplified Arabic" w:cs="Simplified Arabic"/>
+                <w:color w:val="000000" w:themeColor="text1"/>
+                <w:rtl/>
+              </w:rPr>
+              <w:t>${</w:t>
+            </w:r>
+            <w:r>
+              <w:rPr>
+                <w:rFonts w:ascii="Simplified Arabic" w:hAnsi="Simplified Arabic" w:cs="Simplified Arabic"/>
+                <w:color w:val="000000" w:themeColor="text1"/>
+              </w:rPr>
+              <w:t>reflection_unsatisfactory_adjustment</w:t>
+            </w:r>
+            <w:r>
+              <w:rPr>
+                <w:rFonts w:ascii="Simplified Arabic" w:hAnsi="Simplified Arabic" w:cs="Simplified Arabic"/>
+                <w:color w:val="000000" w:themeColor="text1"/>
+                <w:rtl/>
+              </w:rPr>
+              <w:t>}</w:t>
+            </w:r>
+          </w:p>
+        </w:tc>
+        <w:tc>
+          <w:tcPr>
+            <w:tcW w:w="2760" w:type="dxa"/>
+          </w:tcPr>
+          <w:p>
+            <w:pPr>
+              <w:bidi/>
+              <w:rPr>
+                <w:rFonts w:ascii="Simplified Arabic" w:hAnsi="Simplified Arabic" w:cs="Simplified Arabic"/>
+                <w:color w:val="000000" w:themeColor="text1"/>
+                <w:rtl/>
+              </w:rPr>
+            </w:pPr>
+            <w:r>
+              <w:rPr>
+                <w:rFonts w:ascii="Simplified Arabic" w:hAnsi="Simplified Arabic" w:cs="Simplified Arabic"/>
+                <w:color w:val="000000" w:themeColor="text1"/>
+                <w:rtl/>
+              </w:rPr>
+              <w:t>${</w:t>
+            </w:r>
+            <w:r>
+              <w:rPr>
+                <w:rFonts w:ascii="Simplified Arabic" w:hAnsi="Simplified Arabic" w:cs="Simplified Arabic"/>
+                <w:color w:val="000000" w:themeColor="text1"/>
+              </w:rPr>
+              <w:t>reflection_neutral_adjustment</w:t>
+            </w:r>
+            <w:r>
+              <w:rPr>
+                <w:rFonts w:ascii="Simplified Arabic" w:hAnsi="Simplified Arabic" w:cs="Simplified Arabic"/>
+                <w:color w:val="000000" w:themeColor="text1"/>
+                <w:rtl/>
+              </w:rPr>
+              <w:t>}</w:t>
+            </w:r>
+          </w:p>
+        </w:tc>
+      </w:tr>
+    </w:tbl>
+    <w:p>
+      <w:pPr>
+        <w:bidi/>
+        <w:rPr>
+          <w:rFonts w:ascii="Sakkal Majalla" w:eastAsia="Sakkal Majalla" w:hAnsi="Sakkal Majalla" w:cs="Sakkal Majalla"/>
+          <w:b/>
+          <w:bCs/>
+          <w:color w:val="000000" w:themeColor="text1"/>
+          <w:u w:val="single"/>
+          <w:rtl/>
+        </w:rPr>
       </w:pPr>
     </w:p>
     <w:p>
       <w:pPr>
-        <w:bidi/>
+        <w:rPr>
+          <w:rFonts w:ascii="Sakkal Majalla" w:eastAsia="Sakkal Majalla" w:hAnsi="Sakkal Majalla" w:cs="Sakkal Majalla"/>
+          <w:lang w:bidi="ar-JO"/>
+        </w:rPr>
+      </w:pPr>
+    </w:p>
+    <w:p>
+      <w:pPr>
+        <w:rPr>
+          <w:rFonts w:ascii="Sakkal Majalla" w:eastAsia="Sakkal Majalla" w:hAnsi="Sakkal Majalla" w:cs="Sakkal Majalla"/>
+          <w:lang w:bidi="ar-JO"/>
+        </w:rPr>
+      </w:pPr>
+    </w:p>
+    <w:p>
+      <w:pPr>
+        <w:rPr>
+          <w:rFonts w:ascii="Sakkal Majalla" w:eastAsia="Sakkal Majalla" w:hAnsi="Sakkal Majalla" w:cs="Sakkal Majalla"/>
+          <w:lang w:bidi="ar-JO"/>
+        </w:rPr>
+      </w:pPr>
+    </w:p>
+    <w:p>
+      <w:pPr>
+        <w:rPr>
+          <w:rFonts w:ascii="Sakkal Majalla" w:eastAsia="Sakkal Majalla" w:hAnsi="Sakkal Majalla" w:cs="Sakkal Majalla"/>
+          <w:lang w:bidi="ar-JO"/>
+        </w:rPr>
+      </w:pPr>
+    </w:p>
+    <w:p>
+      <w:pPr>
+        <w:rPr>
+          <w:rFonts w:ascii="Sakkal Majalla" w:eastAsia="Sakkal Majalla" w:hAnsi="Sakkal Majalla" w:cs="Sakkal Majalla"/>
+          <w:lang w:bidi="ar-JO"/>
+        </w:rPr>
+      </w:pPr>
+    </w:p>
+    <w:p>
+      <w:pPr>
         <w:rPr>
           <w:rFonts w:ascii="Sakkal Majalla" w:eastAsia="Sakkal Majalla" w:hAnsi="Sakkal Majalla" w:cs="Sakkal Majalla"/>
           <w:color w:val="000000" w:themeColor="text1"/>
@@ -1288,7 +1783,56 @@
     </w:p>
     <w:p>
       <w:pPr>
-        <w:bidi/>
+        <w:rPr>
+          <w:rFonts w:ascii="Sakkal Majalla" w:eastAsia="Sakkal Majalla" w:hAnsi="Sakkal Majalla" w:cs="Sakkal Majalla"/>
+          <w:color w:val="000000" w:themeColor="text1"/>
+          <w:rtl/>
+          <w:lang w:bidi="ar-JO"/>
+        </w:rPr>
+      </w:pPr>
+    </w:p>
+    <w:p>
+      <w:pPr>
+        <w:rPr>
+          <w:rFonts w:ascii="Sakkal Majalla" w:eastAsia="Sakkal Majalla" w:hAnsi="Sakkal Majalla" w:cs="Sakkal Majalla"/>
+          <w:color w:val="000000" w:themeColor="text1"/>
+          <w:rtl/>
+          <w:lang w:bidi="ar-JO"/>
+        </w:rPr>
+      </w:pPr>
+    </w:p>
+    <w:p>
+      <w:pPr>
+        <w:rPr>
+          <w:rFonts w:ascii="Sakkal Majalla" w:eastAsia="Sakkal Majalla" w:hAnsi="Sakkal Majalla" w:cs="Sakkal Majalla"/>
+          <w:color w:val="000000" w:themeColor="text1"/>
+          <w:rtl/>
+          <w:lang w:bidi="ar-JO"/>
+        </w:rPr>
+      </w:pPr>
+    </w:p>
+    <w:p>
+      <w:pPr>
+        <w:rPr>
+          <w:rFonts w:ascii="Sakkal Majalla" w:eastAsia="Sakkal Majalla" w:hAnsi="Sakkal Majalla" w:cs="Sakkal Majalla"/>
+          <w:color w:val="000000" w:themeColor="text1"/>
+          <w:rtl/>
+          <w:lang w:bidi="ar-JO"/>
+        </w:rPr>
+      </w:pPr>
+    </w:p>
+    <w:p>
+      <w:pPr>
+        <w:rPr>
+          <w:rFonts w:ascii="Sakkal Majalla" w:eastAsia="Sakkal Majalla" w:hAnsi="Sakkal Majalla" w:cs="Sakkal Majalla"/>
+          <w:color w:val="000000" w:themeColor="text1"/>
+          <w:rtl/>
+          <w:lang w:bidi="ar-JO"/>
+        </w:rPr>
+      </w:pPr>
+    </w:p>
+    <w:p>
+      <w:pPr>
         <w:rPr>
           <w:rFonts w:ascii="Sakkal Majalla" w:eastAsia="Sakkal Majalla" w:hAnsi="Sakkal Majalla" w:cs="Sakkal Majalla"/>
           <w:color w:val="000000" w:themeColor="text1"/>
@@ -1323,7 +1867,6 @@
     </w:p>
     <w:p>
       <w:pPr>
-        <w:bidi/>
         <w:jc w:val="right"/>
         <w:rPr>
           <w:rFonts w:ascii="Sakkal Majalla" w:eastAsia="Sakkal Majalla" w:hAnsi="Sakkal Majalla" w:cs="Sakkal Majalla"/>

</xml_diff>